<commit_message>
UPDATE - modify earthquake documentation
</commit_message>
<xml_diff>
--- a/doc/Documentation technique Earthquakes.docx
+++ b/doc/Documentation technique Earthquakes.docx
@@ -72,7 +72,11 @@
       </w:pPr>
       <w:r>
         <w:rPr/>
-        <w:t xml:space="preserve">Version 1 </w:t>
+        <w:t xml:space="preserve">Version </w:t>
+      </w:r>
+      <w:r>
+        <w:rPr/>
+        <w:t>2</w:t>
       </w:r>
     </w:p>
     <w:p>
@@ -176,16 +180,16 @@
       <w:pPr>
         <w:pStyle w:val="Heading1"/>
       </w:pPr>
-      <w:bookmarkStart w:name="_Toc1838354809" w:id="952911827"/>
+      <w:bookmarkStart w:name="_Toc854240864" w:id="28461316"/>
       <w:r>
         <w:rPr/>
         <w:t>Table des matières</w:t>
       </w:r>
-      <w:bookmarkEnd w:id="952911827"/>
+      <w:bookmarkEnd w:id="28461316"/>
     </w:p>
     <w:sdt>
       <w:sdtPr>
-        <w:id w:val="1448065784"/>
+        <w:id w:val="700863661"/>
         <w:docPartObj>
           <w:docPartGallery w:val="Table of Contents"/>
           <w:docPartUnique/>
@@ -212,7 +216,7 @@
           <w:r>
             <w:fldChar w:fldCharType="separate"/>
           </w:r>
-          <w:hyperlink w:anchor="_Toc1838354809">
+          <w:hyperlink w:anchor="_Toc854240864">
             <w:r>
               <w:rPr>
                 <w:rStyle w:val="Hyperlink"/>
@@ -226,7 +230,7 @@
               <w:fldChar w:fldCharType="begin"/>
             </w:r>
             <w:r>
-              <w:instrText xml:space="preserve">PAGEREF _Toc1838354809 \h</w:instrText>
+              <w:instrText xml:space="preserve">PAGEREF _Toc854240864 \h</w:instrText>
             </w:r>
             <w:r>
               <w:fldChar w:fldCharType="separate"/>
@@ -253,7 +257,7 @@
               <w:rStyle w:val="Hyperlink"/>
             </w:rPr>
           </w:pPr>
-          <w:hyperlink w:anchor="_Toc1822839156">
+          <w:hyperlink w:anchor="_Toc1326482680">
             <w:r>
               <w:rPr>
                 <w:rStyle w:val="Hyperlink"/>
@@ -267,7 +271,7 @@
               <w:fldChar w:fldCharType="begin"/>
             </w:r>
             <w:r>
-              <w:instrText xml:space="preserve">PAGEREF _Toc1822839156 \h</w:instrText>
+              <w:instrText xml:space="preserve">PAGEREF _Toc1326482680 \h</w:instrText>
             </w:r>
             <w:r>
               <w:fldChar w:fldCharType="separate"/>
@@ -294,7 +298,7 @@
               <w:rStyle w:val="Hyperlink"/>
             </w:rPr>
           </w:pPr>
-          <w:hyperlink w:anchor="_Toc328689074">
+          <w:hyperlink w:anchor="_Toc1585268490">
             <w:r>
               <w:rPr>
                 <w:rStyle w:val="Hyperlink"/>
@@ -308,7 +312,7 @@
               <w:fldChar w:fldCharType="begin"/>
             </w:r>
             <w:r>
-              <w:instrText xml:space="preserve">PAGEREF _Toc328689074 \h</w:instrText>
+              <w:instrText xml:space="preserve">PAGEREF _Toc1585268490 \h</w:instrText>
             </w:r>
             <w:r>
               <w:fldChar w:fldCharType="separate"/>
@@ -335,12 +339,12 @@
               <w:rStyle w:val="Hyperlink"/>
             </w:rPr>
           </w:pPr>
-          <w:hyperlink w:anchor="_Toc819605508">
+          <w:hyperlink w:anchor="_Toc2126467061">
             <w:r>
               <w:rPr>
                 <w:rStyle w:val="Hyperlink"/>
               </w:rPr>
-              <w:t>Architecture</w:t>
+              <w:t>Objectif</w:t>
             </w:r>
             <w:r>
               <w:tab/>
@@ -349,7 +353,7 @@
               <w:fldChar w:fldCharType="begin"/>
             </w:r>
             <w:r>
-              <w:instrText xml:space="preserve">PAGEREF _Toc819605508 \h</w:instrText>
+              <w:instrText xml:space="preserve">PAGEREF _Toc2126467061 \h</w:instrText>
             </w:r>
             <w:r>
               <w:fldChar w:fldCharType="separate"/>
@@ -376,12 +380,12 @@
               <w:rStyle w:val="Hyperlink"/>
             </w:rPr>
           </w:pPr>
-          <w:hyperlink w:anchor="_Toc112244949">
+          <w:hyperlink w:anchor="_Toc1357968011">
             <w:r>
               <w:rPr>
                 <w:rStyle w:val="Hyperlink"/>
               </w:rPr>
-              <w:t>Données</w:t>
+              <w:t>Github</w:t>
             </w:r>
             <w:r>
               <w:tab/>
@@ -390,7 +394,7 @@
               <w:fldChar w:fldCharType="begin"/>
             </w:r>
             <w:r>
-              <w:instrText xml:space="preserve">PAGEREF _Toc112244949 \h</w:instrText>
+              <w:instrText xml:space="preserve">PAGEREF _Toc1357968011 \h</w:instrText>
             </w:r>
             <w:r>
               <w:fldChar w:fldCharType="separate"/>
@@ -417,11 +421,216 @@
               <w:rStyle w:val="Hyperlink"/>
             </w:rPr>
           </w:pPr>
-          <w:hyperlink w:anchor="_Toc1406988185">
+          <w:hyperlink w:anchor="_Toc2003188827">
             <w:r>
               <w:rPr>
                 <w:rStyle w:val="Hyperlink"/>
               </w:rPr>
+              <w:t>Architecture</w:t>
+            </w:r>
+            <w:r>
+              <w:tab/>
+            </w:r>
+            <w:r>
+              <w:fldChar w:fldCharType="begin"/>
+            </w:r>
+            <w:r>
+              <w:instrText xml:space="preserve">PAGEREF _Toc2003188827 \h</w:instrText>
+            </w:r>
+            <w:r>
+              <w:fldChar w:fldCharType="separate"/>
+            </w:r>
+            <w:r>
+              <w:rPr>
+                <w:rStyle w:val="Hyperlink"/>
+              </w:rPr>
+              <w:t>4</w:t>
+            </w:r>
+            <w:r>
+              <w:fldChar w:fldCharType="end"/>
+            </w:r>
+          </w:hyperlink>
+        </w:p>
+        <w:p>
+          <w:pPr>
+            <w:pStyle w:val="TOC1"/>
+            <w:tabs>
+              <w:tab w:val="right" w:leader="dot" w:pos="9015"/>
+            </w:tabs>
+            <w:bidi w:val="0"/>
+            <w:rPr>
+              <w:rStyle w:val="Hyperlink"/>
+            </w:rPr>
+          </w:pPr>
+          <w:hyperlink w:anchor="_Toc466108503">
+            <w:r>
+              <w:rPr>
+                <w:rStyle w:val="Hyperlink"/>
+              </w:rPr>
+              <w:t>Données</w:t>
+            </w:r>
+            <w:r>
+              <w:tab/>
+            </w:r>
+            <w:r>
+              <w:fldChar w:fldCharType="begin"/>
+            </w:r>
+            <w:r>
+              <w:instrText xml:space="preserve">PAGEREF _Toc466108503 \h</w:instrText>
+            </w:r>
+            <w:r>
+              <w:fldChar w:fldCharType="separate"/>
+            </w:r>
+            <w:r>
+              <w:rPr>
+                <w:rStyle w:val="Hyperlink"/>
+              </w:rPr>
+              <w:t>4</w:t>
+            </w:r>
+            <w:r>
+              <w:fldChar w:fldCharType="end"/>
+            </w:r>
+          </w:hyperlink>
+        </w:p>
+        <w:p>
+          <w:pPr>
+            <w:pStyle w:val="TOC2"/>
+            <w:tabs>
+              <w:tab w:val="right" w:leader="dot" w:pos="9015"/>
+            </w:tabs>
+            <w:bidi w:val="0"/>
+            <w:rPr>
+              <w:rStyle w:val="Hyperlink"/>
+            </w:rPr>
+          </w:pPr>
+          <w:hyperlink w:anchor="_Toc430254373">
+            <w:r>
+              <w:rPr>
+                <w:rStyle w:val="Hyperlink"/>
+              </w:rPr>
+              <w:t>Visualisation des données pour la prédiction du SIG</w:t>
+            </w:r>
+            <w:r>
+              <w:tab/>
+            </w:r>
+            <w:r>
+              <w:fldChar w:fldCharType="begin"/>
+            </w:r>
+            <w:r>
+              <w:instrText xml:space="preserve">PAGEREF _Toc430254373 \h</w:instrText>
+            </w:r>
+            <w:r>
+              <w:fldChar w:fldCharType="separate"/>
+            </w:r>
+            <w:r>
+              <w:rPr>
+                <w:rStyle w:val="Hyperlink"/>
+              </w:rPr>
+              <w:t>6</w:t>
+            </w:r>
+            <w:r>
+              <w:fldChar w:fldCharType="end"/>
+            </w:r>
+          </w:hyperlink>
+        </w:p>
+        <w:p>
+          <w:pPr>
+            <w:pStyle w:val="TOC2"/>
+            <w:tabs>
+              <w:tab w:val="right" w:leader="dot" w:pos="9015"/>
+            </w:tabs>
+            <w:bidi w:val="0"/>
+            <w:rPr>
+              <w:rStyle w:val="Hyperlink"/>
+            </w:rPr>
+          </w:pPr>
+          <w:hyperlink w:anchor="_Toc616676542">
+            <w:r>
+              <w:rPr>
+                <w:rStyle w:val="Hyperlink"/>
+              </w:rPr>
+              <w:t>Visualisation des données pour la prédiction de l’alerte</w:t>
+            </w:r>
+            <w:r>
+              <w:tab/>
+            </w:r>
+            <w:r>
+              <w:fldChar w:fldCharType="begin"/>
+            </w:r>
+            <w:r>
+              <w:instrText xml:space="preserve">PAGEREF _Toc616676542 \h</w:instrText>
+            </w:r>
+            <w:r>
+              <w:fldChar w:fldCharType="separate"/>
+            </w:r>
+            <w:r>
+              <w:rPr>
+                <w:rStyle w:val="Hyperlink"/>
+              </w:rPr>
+              <w:t>7</w:t>
+            </w:r>
+            <w:r>
+              <w:fldChar w:fldCharType="end"/>
+            </w:r>
+          </w:hyperlink>
+        </w:p>
+        <w:p>
+          <w:pPr>
+            <w:pStyle w:val="TOC2"/>
+            <w:tabs>
+              <w:tab w:val="right" w:leader="dot" w:pos="9015"/>
+            </w:tabs>
+            <w:bidi w:val="0"/>
+            <w:rPr>
+              <w:rStyle w:val="Hyperlink"/>
+            </w:rPr>
+          </w:pPr>
+          <w:hyperlink w:anchor="_Toc276126750">
+            <w:r>
+              <w:rPr>
+                <w:rStyle w:val="Hyperlink"/>
+              </w:rPr>
+              <w:t>Pré-traitement des données</w:t>
+            </w:r>
+            <w:r>
+              <w:tab/>
+            </w:r>
+            <w:r>
+              <w:fldChar w:fldCharType="begin"/>
+            </w:r>
+            <w:r>
+              <w:instrText xml:space="preserve">PAGEREF _Toc276126750 \h</w:instrText>
+            </w:r>
+            <w:r>
+              <w:fldChar w:fldCharType="separate"/>
+            </w:r>
+            <w:r>
+              <w:rPr>
+                <w:rStyle w:val="Hyperlink"/>
+              </w:rPr>
+              <w:t>9</w:t>
+            </w:r>
+            <w:r>
+              <w:fldChar w:fldCharType="end"/>
+            </w:r>
+          </w:hyperlink>
+        </w:p>
+        <w:p>
+          <w:pPr>
+            <w:pStyle w:val="TOC1"/>
+            <w:tabs>
+              <w:tab w:val="right" w:leader="dot" w:pos="9015"/>
+            </w:tabs>
+            <w:bidi w:val="0"/>
+            <w:rPr>
+              <w:rStyle w:val="Hyperlink"/>
+            </w:rPr>
+          </w:pPr>
+          <w:hyperlink w:anchor="_Toc1610812612">
+            <w:r>
+              <w:rPr>
+                <w:rStyle w:val="Hyperlink"/>
+              </w:rPr>
               <w:t>Modèles</w:t>
             </w:r>
             <w:r>
@@ -431,7 +640,7 @@
               <w:fldChar w:fldCharType="begin"/>
             </w:r>
             <w:r>
-              <w:instrText xml:space="preserve">PAGEREF _Toc1406988185 \h</w:instrText>
+              <w:instrText xml:space="preserve">PAGEREF _Toc1610812612 \h</w:instrText>
             </w:r>
             <w:r>
               <w:fldChar w:fldCharType="separate"/>
@@ -440,7 +649,130 @@
               <w:rPr>
                 <w:rStyle w:val="Hyperlink"/>
               </w:rPr>
-              <w:t>6</w:t>
+              <w:t>10</w:t>
+            </w:r>
+            <w:r>
+              <w:fldChar w:fldCharType="end"/>
+            </w:r>
+          </w:hyperlink>
+        </w:p>
+        <w:p>
+          <w:pPr>
+            <w:pStyle w:val="TOC2"/>
+            <w:tabs>
+              <w:tab w:val="right" w:leader="dot" w:pos="9015"/>
+            </w:tabs>
+            <w:bidi w:val="0"/>
+            <w:rPr>
+              <w:rStyle w:val="Hyperlink"/>
+            </w:rPr>
+          </w:pPr>
+          <w:hyperlink w:anchor="_Toc1542514101">
+            <w:r>
+              <w:rPr>
+                <w:rStyle w:val="Hyperlink"/>
+              </w:rPr>
+              <w:t>Prédiction de l’alerte</w:t>
+            </w:r>
+            <w:r>
+              <w:tab/>
+            </w:r>
+            <w:r>
+              <w:fldChar w:fldCharType="begin"/>
+            </w:r>
+            <w:r>
+              <w:instrText xml:space="preserve">PAGEREF _Toc1542514101 \h</w:instrText>
+            </w:r>
+            <w:r>
+              <w:fldChar w:fldCharType="separate"/>
+            </w:r>
+            <w:r>
+              <w:rPr>
+                <w:rStyle w:val="Hyperlink"/>
+              </w:rPr>
+              <w:t>10</w:t>
+            </w:r>
+            <w:r>
+              <w:fldChar w:fldCharType="end"/>
+            </w:r>
+          </w:hyperlink>
+        </w:p>
+        <w:p>
+          <w:pPr>
+            <w:pStyle w:val="TOC2"/>
+            <w:tabs>
+              <w:tab w:val="right" w:leader="dot" w:pos="9015"/>
+            </w:tabs>
+            <w:bidi w:val="0"/>
+            <w:rPr>
+              <w:rStyle w:val="Hyperlink"/>
+            </w:rPr>
+          </w:pPr>
+          <w:hyperlink w:anchor="_Toc139627773">
+            <w:r>
+              <w:rPr>
+                <w:rStyle w:val="Hyperlink"/>
+              </w:rPr>
+              <w:t>Model cards</w:t>
+            </w:r>
+            <w:r>
+              <w:tab/>
+            </w:r>
+            <w:r>
+              <w:fldChar w:fldCharType="begin"/>
+            </w:r>
+            <w:r>
+              <w:instrText xml:space="preserve">PAGEREF _Toc139627773 \h</w:instrText>
+            </w:r>
+            <w:r>
+              <w:fldChar w:fldCharType="separate"/>
+            </w:r>
+            <w:r>
+              <w:rPr>
+                <w:rStyle w:val="Hyperlink"/>
+              </w:rPr>
+              <w:t>11</w:t>
+            </w:r>
+            <w:r>
+              <w:fldChar w:fldCharType="end"/>
+            </w:r>
+          </w:hyperlink>
+        </w:p>
+        <w:p>
+          <w:pPr>
+            <w:pStyle w:val="TOC1"/>
+            <w:tabs>
+              <w:tab w:val="right" w:leader="dot" w:pos="9015"/>
+            </w:tabs>
+            <w:bidi w:val="0"/>
+            <w:rPr>
+              <w:rStyle w:val="Hyperlink"/>
+            </w:rPr>
+          </w:pPr>
+          <w:hyperlink w:anchor="_Toc222574100">
+            <w:r>
+              <w:rPr>
+                <w:rStyle w:val="Hyperlink"/>
+              </w:rPr>
+              <w:t>Conclusion et perspectives</w:t>
+            </w:r>
+            <w:r>
+              <w:tab/>
+            </w:r>
+            <w:r>
+              <w:fldChar w:fldCharType="begin"/>
+            </w:r>
+            <w:r>
+              <w:instrText xml:space="preserve">PAGEREF _Toc222574100 \h</w:instrText>
+            </w:r>
+            <w:r>
+              <w:fldChar w:fldCharType="separate"/>
+            </w:r>
+            <w:r>
+              <w:rPr>
+                <w:rStyle w:val="Hyperlink"/>
+              </w:rPr>
+              <w:t>11</w:t>
             </w:r>
             <w:r>
               <w:fldChar w:fldCharType="end"/>
@@ -461,12 +793,12 @@
       <w:pPr>
         <w:pStyle w:val="Heading1"/>
       </w:pPr>
-      <w:bookmarkStart w:name="_Toc1822839156" w:id="668158952"/>
+      <w:bookmarkStart w:name="_Toc1326482680" w:id="362409911"/>
       <w:r>
         <w:rPr/>
         <w:t>Historique des versions</w:t>
       </w:r>
-      <w:bookmarkEnd w:id="668158952"/>
+      <w:bookmarkEnd w:id="362409911"/>
     </w:p>
     <w:tbl>
       <w:tblPr>
@@ -600,6 +932,10 @@
             <w:pPr>
               <w:pStyle w:val="Normal"/>
             </w:pPr>
+            <w:r>
+              <w:rPr/>
+              <w:t>2</w:t>
+            </w:r>
           </w:p>
         </w:tc>
         <w:tc>
@@ -611,6 +947,10 @@
             <w:pPr>
               <w:pStyle w:val="Normal"/>
             </w:pPr>
+            <w:r>
+              <w:rPr/>
+              <w:t>20/02/2026</w:t>
+            </w:r>
           </w:p>
         </w:tc>
         <w:tc>
@@ -622,6 +962,10 @@
             <w:pPr>
               <w:pStyle w:val="Normal"/>
             </w:pPr>
+            <w:r>
+              <w:rPr/>
+              <w:t>Hoareau, Nowe, Delauney</w:t>
+            </w:r>
           </w:p>
         </w:tc>
       </w:tr>
@@ -724,12 +1068,12 @@
       <w:pPr>
         <w:pStyle w:val="Heading1"/>
       </w:pPr>
-      <w:bookmarkStart w:name="_Toc328689074" w:id="558426410"/>
+      <w:bookmarkStart w:name="_Toc1585268490" w:id="1516721955"/>
       <w:r>
         <w:rPr/>
         <w:t>Introduction et contexte</w:t>
       </w:r>
-      <w:bookmarkEnd w:id="558426410"/>
+      <w:bookmarkEnd w:id="1516721955"/>
     </w:p>
     <w:p>
       <w:pPr>
@@ -808,6 +1152,17 @@
         <w:rPr/>
         <w:t>.</w:t>
       </w:r>
+    </w:p>
+    <w:p>
+      <w:pPr>
+        <w:pStyle w:val="Heading1"/>
+      </w:pPr>
+      <w:bookmarkStart w:name="_Toc2126467061" w:id="1798598048"/>
+      <w:r>
+        <w:rPr/>
+        <w:t>Objectif</w:t>
+      </w:r>
+      <w:bookmarkEnd w:id="1798598048"/>
     </w:p>
     <w:p>
       <w:pPr>
@@ -856,6 +1211,17 @@
         <w:rPr/>
         <w:t>u séisme.</w:t>
       </w:r>
+    </w:p>
+    <w:p>
+      <w:pPr>
+        <w:pStyle w:val="Heading1"/>
+      </w:pPr>
+      <w:bookmarkStart w:name="_Toc1357968011" w:id="168163684"/>
+      <w:r>
+        <w:rPr/>
+        <w:t>Github</w:t>
+      </w:r>
+      <w:bookmarkEnd w:id="168163684"/>
     </w:p>
     <w:p>
       <w:pPr>
@@ -913,14 +1279,14 @@
       <w:pPr>
         <w:pStyle w:val="Heading1"/>
       </w:pPr>
-      <w:bookmarkStart w:name="_Toc819605508" w:id="1558869403"/>
+      <w:bookmarkStart w:name="_Toc2003188827" w:id="1204418677"/>
       <w:r>
         <w:rPr/>
         <w:t>Architecture</w:t>
       </w:r>
-      <w:bookmarkEnd w:id="1558869403"/>
-    </w:p>
-    <w:p>
+      <w:bookmarkEnd w:id="1204418677"/>
+    </w:p>
+    <w:p w14:noSpellErr="1">
       <w:pPr>
         <w:pStyle w:val="Normal"/>
       </w:pPr>
@@ -931,10 +1297,10 @@
       </w:pPr>
       <w:r>
         <w:drawing>
-          <wp:inline wp14:editId="26481197" wp14:anchorId="65CE7287">
-            <wp:extent cx="5724525" cy="1647825"/>
+          <wp:inline wp14:editId="552AF25E" wp14:anchorId="03102703">
+            <wp:extent cx="5724525" cy="1638300"/>
             <wp:effectExtent l="0" t="0" r="0" b="0"/>
-            <wp:docPr id="950006725" name="drawing"/>
+            <wp:docPr id="1451684306" name="drawing"/>
             <wp:cNvGraphicFramePr>
               <a:graphicFrameLocks noChangeAspect="1"/>
             </wp:cNvGraphicFramePr>
@@ -942,11 +1308,11 @@
               <a:graphicData xmlns:a="http://schemas.openxmlformats.org/drawingml/2006/main" uri="http://schemas.openxmlformats.org/drawingml/2006/picture">
                 <pic:pic xmlns:pic="http://schemas.openxmlformats.org/drawingml/2006/picture">
                   <pic:nvPicPr>
-                    <pic:cNvPr id="950006725" name="Picture 950006725"/>
+                    <pic:cNvPr id="1451684306" name="Picture 1451684306"/>
                     <pic:cNvPicPr/>
                   </pic:nvPicPr>
                   <pic:blipFill>
-                    <a:blip xmlns:r="http://schemas.openxmlformats.org/officeDocument/2006/relationships" r:embed="rId1203566964">
+                    <a:blip xmlns:r="http://schemas.openxmlformats.org/officeDocument/2006/relationships" r:embed="rId2088520174">
                       <a:extLst>
                         <a:ext uri="{28A0092B-C50C-407E-A947-70E740481C1C}">
                           <a14:useLocalDpi xmlns:a14="http://schemas.microsoft.com/office/drawing/2010/main"/>
@@ -960,7 +1326,7 @@
                   <pic:spPr>
                     <a:xfrm>
                       <a:off x="0" y="0"/>
-                      <a:ext cx="5724525" cy="1647825"/>
+                      <a:ext cx="5724525" cy="1638300"/>
                     </a:xfrm>
                     <a:prstGeom prst="rect">
                       <a:avLst/>
@@ -977,16 +1343,19 @@
       <w:pPr>
         <w:pStyle w:val="Heading1"/>
       </w:pPr>
-      <w:bookmarkStart w:name="_Toc112244949" w:id="430317704"/>
+      <w:bookmarkStart w:name="_Toc466108503" w:id="272705689"/>
       <w:r>
         <w:rPr/>
         <w:t>Données</w:t>
       </w:r>
-      <w:bookmarkEnd w:id="430317704"/>
+      <w:bookmarkEnd w:id="272705689"/>
     </w:p>
     <w:p>
       <w:pPr>
         <w:pStyle w:val="Normal"/>
+        <w:suppressLineNumbers w:val="0"/>
+        <w:spacing w:before="0" w:beforeAutospacing="off" w:after="160" w:afterAutospacing="off" w:line="279" w:lineRule="auto"/>
+        <w:ind/>
       </w:pPr>
       <w:r>
         <w:rPr/>
@@ -1002,44 +1371,8 @@
       </w:r>
       <w:r>
         <w:rPr/>
-        <w:t>earthquake_d</w:t>
-      </w:r>
-      <w:r>
-        <w:rPr/>
-        <w:t>ata</w:t>
-      </w:r>
-      <w:r>
-        <w:rPr/>
-        <w:t xml:space="preserve"> </w:t>
-      </w:r>
-      <w:r>
-        <w:rPr/>
-        <w:t>do</w:t>
-      </w:r>
-      <w:r>
-        <w:rPr/>
-        <w:t xml:space="preserve">nt la data </w:t>
-      </w:r>
-      <w:r>
-        <w:rPr/>
-        <w:t>card</w:t>
-      </w:r>
-      <w:r>
-        <w:rPr/>
-        <w:t xml:space="preserve"> est trouv</w:t>
-      </w:r>
-      <w:r>
-        <w:rPr/>
-        <w:t xml:space="preserve">able </w:t>
-      </w:r>
-      <w:hyperlink r:id="Rdfa24933d5a042d2">
-        <w:r>
-          <w:rPr>
-            <w:rStyle w:val="Hyperlink"/>
-          </w:rPr>
-          <w:t>ici</w:t>
-        </w:r>
-      </w:hyperlink>
+        <w:t>earthquake_data</w:t>
+      </w:r>
       <w:r>
         <w:rPr/>
         <w:t>.</w:t>
@@ -1048,6 +1381,26 @@
     <w:p>
       <w:pPr>
         <w:pStyle w:val="Normal"/>
+        <w:suppressLineNumbers w:val="0"/>
+        <w:spacing w:before="0" w:beforeAutospacing="off" w:after="160" w:afterAutospacing="off" w:line="279" w:lineRule="auto"/>
+        <w:ind/>
+        <w:rPr>
+          <w:u w:val="single"/>
+        </w:rPr>
+      </w:pPr>
+      <w:r>
+        <w:rPr>
+          <w:u w:val="single"/>
+        </w:rPr>
+        <w:t>Visualisation</w:t>
+      </w:r>
+    </w:p>
+    <w:p>
+      <w:pPr>
+        <w:pStyle w:val="Normal"/>
+        <w:suppressLineNumbers w:val="0"/>
+        <w:spacing w:before="0" w:beforeAutospacing="off" w:after="160" w:afterAutospacing="off" w:line="279" w:lineRule="auto"/>
+        <w:ind/>
         <w:rPr>
           <w:b w:val="0"/>
           <w:bCs w:val="0"/>
@@ -1055,30 +1408,17 @@
       </w:pPr>
       <w:r>
         <w:rPr/>
-        <w:t xml:space="preserve">Une analyse exploratoire des données a également été réalisée avec la librairie python </w:t>
-      </w:r>
-      <w:r>
-        <w:rPr>
-          <w:b w:val="1"/>
-          <w:bCs w:val="1"/>
-        </w:rPr>
-        <w:t>ydata_</w:t>
-      </w:r>
-      <w:r>
-        <w:rPr>
-          <w:b w:val="1"/>
-          <w:bCs w:val="1"/>
-        </w:rPr>
-        <w:t>profiling</w:t>
-      </w:r>
-      <w:r>
-        <w:rPr>
-          <w:b w:val="0"/>
-          <w:bCs w:val="0"/>
-        </w:rPr>
-        <w:t xml:space="preserve">, trouvable ici : </w:t>
-      </w:r>
-      <w:hyperlink r:id="R5873dd087723450d">
+        <w:t xml:space="preserve">Pour simplement visualiser la data </w:t>
+      </w:r>
+      <w:r>
+        <w:rPr/>
+        <w:t>card</w:t>
+      </w:r>
+      <w:r>
+        <w:rPr/>
+        <w:t xml:space="preserve">, on peut la trouver </w:t>
+      </w:r>
+      <w:hyperlink r:id="R00efbd4d9dc740c3">
         <w:r>
           <w:rPr>
             <w:rStyle w:val="Hyperlink"/>
@@ -1093,7 +1433,474 @@
           <w:b w:val="0"/>
           <w:bCs w:val="0"/>
         </w:rPr>
-        <w:t xml:space="preserve"> au format html.</w:t>
+        <w:t xml:space="preserve"> au format html. Elle a été réalisée avec la librairie python </w:t>
+      </w:r>
+      <w:r>
+        <w:rPr>
+          <w:b w:val="1"/>
+          <w:bCs w:val="1"/>
+        </w:rPr>
+        <w:t>ydata_profiling</w:t>
+      </w:r>
+      <w:r>
+        <w:rPr>
+          <w:b w:val="1"/>
+          <w:bCs w:val="1"/>
+        </w:rPr>
+        <w:t xml:space="preserve">. </w:t>
+      </w:r>
+      <w:r>
+        <w:rPr>
+          <w:b w:val="0"/>
+          <w:bCs w:val="0"/>
+        </w:rPr>
+        <w:t xml:space="preserve">Il suffit d’ouvrir le fichier dans un navigateur par exemple, pour </w:t>
+      </w:r>
+      <w:r>
+        <w:rPr>
+          <w:b w:val="0"/>
+          <w:bCs w:val="0"/>
+        </w:rPr>
+        <w:t>visualiser :</w:t>
+      </w:r>
+    </w:p>
+    <w:p>
+      <w:pPr>
+        <w:pStyle w:val="ListParagraph"/>
+        <w:numPr>
+          <w:ilvl w:val="0"/>
+          <w:numId w:val="6"/>
+        </w:numPr>
+        <w:suppressLineNumbers w:val="0"/>
+        <w:spacing w:before="0" w:beforeAutospacing="off" w:after="160" w:afterAutospacing="off" w:line="279" w:lineRule="auto"/>
+        <w:ind/>
+        <w:rPr>
+          <w:b w:val="0"/>
+          <w:bCs w:val="0"/>
+        </w:rPr>
+      </w:pPr>
+      <w:r>
+        <w:rPr>
+          <w:b w:val="0"/>
+          <w:bCs w:val="0"/>
+        </w:rPr>
+        <w:t xml:space="preserve">Un </w:t>
+      </w:r>
+      <w:r>
+        <w:rPr>
+          <w:b w:val="1"/>
+          <w:bCs w:val="1"/>
+        </w:rPr>
+        <w:t>overview</w:t>
+      </w:r>
+      <w:r>
+        <w:rPr>
+          <w:b w:val="1"/>
+          <w:bCs w:val="1"/>
+        </w:rPr>
+        <w:t xml:space="preserve"> </w:t>
+      </w:r>
+      <w:r>
+        <w:rPr>
+          <w:b w:val="0"/>
+          <w:bCs w:val="0"/>
+        </w:rPr>
+        <w:t>des données</w:t>
+      </w:r>
+    </w:p>
+    <w:p>
+      <w:pPr>
+        <w:pStyle w:val="ListParagraph"/>
+        <w:numPr>
+          <w:ilvl w:val="0"/>
+          <w:numId w:val="6"/>
+        </w:numPr>
+        <w:suppressLineNumbers w:val="0"/>
+        <w:spacing w:before="0" w:beforeAutospacing="off" w:after="160" w:afterAutospacing="off" w:line="279" w:lineRule="auto"/>
+        <w:ind/>
+        <w:rPr>
+          <w:b w:val="0"/>
+          <w:bCs w:val="0"/>
+        </w:rPr>
+      </w:pPr>
+      <w:r>
+        <w:rPr>
+          <w:b w:val="0"/>
+          <w:bCs w:val="0"/>
+        </w:rPr>
+        <w:t xml:space="preserve">Des données statistiques sur chaque </w:t>
+      </w:r>
+      <w:r>
+        <w:rPr>
+          <w:b w:val="1"/>
+          <w:bCs w:val="1"/>
+        </w:rPr>
+        <w:t>variable</w:t>
+      </w:r>
+    </w:p>
+    <w:p>
+      <w:pPr>
+        <w:pStyle w:val="ListParagraph"/>
+        <w:numPr>
+          <w:ilvl w:val="0"/>
+          <w:numId w:val="6"/>
+        </w:numPr>
+        <w:suppressLineNumbers w:val="0"/>
+        <w:spacing w:before="0" w:beforeAutospacing="off" w:after="160" w:afterAutospacing="off" w:line="279" w:lineRule="auto"/>
+        <w:ind/>
+        <w:rPr>
+          <w:b w:val="0"/>
+          <w:bCs w:val="0"/>
+        </w:rPr>
+      </w:pPr>
+      <w:r>
+        <w:rPr>
+          <w:b w:val="0"/>
+          <w:bCs w:val="0"/>
+        </w:rPr>
+        <w:t xml:space="preserve">Les </w:t>
+      </w:r>
+      <w:r>
+        <w:rPr>
+          <w:b w:val="1"/>
+          <w:bCs w:val="1"/>
+        </w:rPr>
+        <w:t xml:space="preserve">interactions </w:t>
+      </w:r>
+      <w:r>
+        <w:rPr>
+          <w:b w:val="0"/>
+          <w:bCs w:val="0"/>
+        </w:rPr>
+        <w:t>entre variables</w:t>
+      </w:r>
+    </w:p>
+    <w:p>
+      <w:pPr>
+        <w:pStyle w:val="ListParagraph"/>
+        <w:numPr>
+          <w:ilvl w:val="0"/>
+          <w:numId w:val="6"/>
+        </w:numPr>
+        <w:suppressLineNumbers w:val="0"/>
+        <w:spacing w:before="0" w:beforeAutospacing="off" w:after="160" w:afterAutospacing="off" w:line="279" w:lineRule="auto"/>
+        <w:ind/>
+        <w:rPr>
+          <w:b w:val="0"/>
+          <w:bCs w:val="0"/>
+        </w:rPr>
+      </w:pPr>
+      <w:r>
+        <w:rPr>
+          <w:b w:val="0"/>
+          <w:bCs w:val="0"/>
+        </w:rPr>
+        <w:t xml:space="preserve">La </w:t>
+      </w:r>
+      <w:r>
+        <w:rPr>
+          <w:b w:val="1"/>
+          <w:bCs w:val="1"/>
+        </w:rPr>
+        <w:t>matrice de corrélation</w:t>
+      </w:r>
+      <w:r>
+        <w:rPr>
+          <w:b w:val="0"/>
+          <w:bCs w:val="0"/>
+        </w:rPr>
+        <w:t xml:space="preserve"> (</w:t>
+      </w:r>
+      <w:r>
+        <w:rPr>
+          <w:b w:val="0"/>
+          <w:bCs w:val="0"/>
+        </w:rPr>
+        <w:t>heatmap</w:t>
+      </w:r>
+      <w:r>
+        <w:rPr>
+          <w:b w:val="0"/>
+          <w:bCs w:val="0"/>
+        </w:rPr>
+        <w:t xml:space="preserve"> ou table)</w:t>
+      </w:r>
+    </w:p>
+    <w:p>
+      <w:pPr>
+        <w:pStyle w:val="ListParagraph"/>
+        <w:numPr>
+          <w:ilvl w:val="0"/>
+          <w:numId w:val="6"/>
+        </w:numPr>
+        <w:suppressLineNumbers w:val="0"/>
+        <w:spacing w:before="0" w:beforeAutospacing="off" w:after="160" w:afterAutospacing="off" w:line="279" w:lineRule="auto"/>
+        <w:ind/>
+        <w:rPr>
+          <w:b w:val="0"/>
+          <w:bCs w:val="0"/>
+        </w:rPr>
+      </w:pPr>
+      <w:r>
+        <w:rPr>
+          <w:b w:val="0"/>
+          <w:bCs w:val="0"/>
+        </w:rPr>
+        <w:t xml:space="preserve">Les </w:t>
+      </w:r>
+      <w:r>
+        <w:rPr>
+          <w:b w:val="1"/>
+          <w:bCs w:val="1"/>
+        </w:rPr>
+        <w:t>valeurs manquantes</w:t>
+      </w:r>
+    </w:p>
+    <w:p>
+      <w:pPr>
+        <w:pStyle w:val="ListParagraph"/>
+        <w:numPr>
+          <w:ilvl w:val="0"/>
+          <w:numId w:val="6"/>
+        </w:numPr>
+        <w:suppressLineNumbers w:val="0"/>
+        <w:spacing w:before="0" w:beforeAutospacing="off" w:after="160" w:afterAutospacing="off" w:line="279" w:lineRule="auto"/>
+        <w:ind/>
+        <w:rPr>
+          <w:b w:val="0"/>
+          <w:bCs w:val="0"/>
+        </w:rPr>
+      </w:pPr>
+      <w:r>
+        <w:rPr>
+          <w:b w:val="0"/>
+          <w:bCs w:val="0"/>
+        </w:rPr>
+        <w:t xml:space="preserve">Un </w:t>
+      </w:r>
+      <w:r>
+        <w:rPr>
+          <w:b w:val="1"/>
+          <w:bCs w:val="1"/>
+        </w:rPr>
+        <w:t xml:space="preserve">échantillon </w:t>
+      </w:r>
+      <w:r>
+        <w:rPr>
+          <w:b w:val="0"/>
+          <w:bCs w:val="0"/>
+        </w:rPr>
+        <w:t>du jeu de données</w:t>
+      </w:r>
+    </w:p>
+    <w:p>
+      <w:pPr>
+        <w:pStyle w:val="Normal"/>
+        <w:suppressLineNumbers w:val="0"/>
+        <w:spacing w:before="0" w:beforeAutospacing="off" w:after="160" w:afterAutospacing="off" w:line="279" w:lineRule="auto"/>
+        <w:ind/>
+        <w:rPr>
+          <w:b w:val="0"/>
+          <w:bCs w:val="0"/>
+        </w:rPr>
+      </w:pPr>
+    </w:p>
+    <w:p>
+      <w:pPr>
+        <w:pStyle w:val="Normal"/>
+        <w:suppressLineNumbers w:val="0"/>
+        <w:spacing w:before="0" w:beforeAutospacing="off" w:after="160" w:afterAutospacing="off" w:line="279" w:lineRule="auto"/>
+        <w:ind/>
+      </w:pPr>
+      <w:r>
+        <w:drawing>
+          <wp:inline wp14:editId="13121A69" wp14:anchorId="5BCC78F2">
+            <wp:extent cx="5724525" cy="2438400"/>
+            <wp:effectExtent l="0" t="0" r="0" b="0"/>
+            <wp:docPr id="1886201703" name="drawing"/>
+            <wp:cNvGraphicFramePr>
+              <a:graphicFrameLocks noChangeAspect="1"/>
+            </wp:cNvGraphicFramePr>
+            <a:graphic>
+              <a:graphicData xmlns:a="http://schemas.openxmlformats.org/drawingml/2006/main" uri="http://schemas.openxmlformats.org/drawingml/2006/picture">
+                <pic:pic xmlns:pic="http://schemas.openxmlformats.org/drawingml/2006/picture">
+                  <pic:nvPicPr>
+                    <pic:cNvPr id="1886201703" name="Picture 1886201703"/>
+                    <pic:cNvPicPr/>
+                  </pic:nvPicPr>
+                  <pic:blipFill>
+                    <a:blip xmlns:r="http://schemas.openxmlformats.org/officeDocument/2006/relationships" r:embed="rId928284335">
+                      <a:extLst>
+                        <a:ext uri="{28A0092B-C50C-407E-A947-70E740481C1C}">
+                          <a14:useLocalDpi xmlns:a14="http://schemas.microsoft.com/office/drawing/2010/main"/>
+                        </a:ext>
+                      </a:extLst>
+                    </a:blip>
+                    <a:stretch>
+                      <a:fillRect/>
+                    </a:stretch>
+                  </pic:blipFill>
+                  <pic:spPr>
+                    <a:xfrm>
+                      <a:off x="0" y="0"/>
+                      <a:ext cx="5724525" cy="2438400"/>
+                    </a:xfrm>
+                    <a:prstGeom prst="rect">
+                      <a:avLst/>
+                    </a:prstGeom>
+                  </pic:spPr>
+                </pic:pic>
+              </a:graphicData>
+            </a:graphic>
+          </wp:inline>
+        </w:drawing>
+      </w:r>
+    </w:p>
+    <w:p>
+      <w:pPr>
+        <w:pStyle w:val="Normal"/>
+        <w:suppressLineNumbers w:val="0"/>
+        <w:spacing w:before="0" w:beforeAutospacing="off" w:after="160" w:afterAutospacing="off" w:line="279" w:lineRule="auto"/>
+        <w:ind/>
+        <w:rPr>
+          <w:u w:val="single"/>
+        </w:rPr>
+      </w:pPr>
+      <w:r>
+        <w:rPr>
+          <w:u w:val="single"/>
+        </w:rPr>
+        <w:t>Parsing</w:t>
+      </w:r>
+    </w:p>
+    <w:p>
+      <w:pPr>
+        <w:pStyle w:val="Normal"/>
+      </w:pPr>
+      <w:r>
+        <w:rPr/>
+        <w:t>L</w:t>
+      </w:r>
+      <w:r>
+        <w:rPr/>
+        <w:t xml:space="preserve">a data </w:t>
+      </w:r>
+      <w:r>
+        <w:rPr/>
+        <w:t>card</w:t>
+      </w:r>
+      <w:r>
+        <w:rPr/>
+        <w:t xml:space="preserve"> est trouv</w:t>
+      </w:r>
+      <w:r>
+        <w:rPr/>
+        <w:t xml:space="preserve">able </w:t>
+      </w:r>
+      <w:hyperlink r:id="Re45bc8f5658a44a0">
+        <w:r>
+          <w:rPr>
+            <w:rStyle w:val="Hyperlink"/>
+          </w:rPr>
+          <w:t>ici</w:t>
+        </w:r>
+      </w:hyperlink>
+      <w:r>
+        <w:rPr/>
+        <w:t xml:space="preserve"> au format </w:t>
+      </w:r>
+      <w:r>
+        <w:rPr/>
+        <w:t>json</w:t>
+      </w:r>
+      <w:r>
+        <w:rPr/>
+        <w:t xml:space="preserve">. Elle a pour but d’être </w:t>
+      </w:r>
+      <w:r>
+        <w:rPr/>
+        <w:t>parsé</w:t>
+      </w:r>
+      <w:r>
+        <w:rPr/>
+        <w:t xml:space="preserve"> en python.</w:t>
+      </w:r>
+    </w:p>
+    <w:p>
+      <w:pPr>
+        <w:pStyle w:val="Normal"/>
+      </w:pPr>
+      <w:r>
+        <w:rPr/>
+        <w:t>En effet, elle contient toutes les données présentées ci-dessus, et peuvent être analysées plus en profondeur grâce à ce fichier json.</w:t>
+      </w:r>
+    </w:p>
+    <w:p>
+      <w:pPr>
+        <w:pStyle w:val="Normal"/>
+      </w:pPr>
+    </w:p>
+    <w:p>
+      <w:pPr>
+        <w:pStyle w:val="Normal"/>
+      </w:pPr>
+    </w:p>
+    <w:p>
+      <w:pPr>
+        <w:pStyle w:val="Normal"/>
+      </w:pPr>
+    </w:p>
+    <w:p>
+      <w:pPr>
+        <w:pStyle w:val="Normal"/>
+      </w:pPr>
+    </w:p>
+    <w:p>
+      <w:pPr>
+        <w:pStyle w:val="Normal"/>
+        <w:suppressLineNumbers w:val="0"/>
+        <w:spacing w:before="0" w:beforeAutospacing="off" w:after="160" w:afterAutospacing="off" w:line="279" w:lineRule="auto"/>
+        <w:ind/>
+      </w:pPr>
+      <w:r>
+        <w:rPr/>
+        <w:t xml:space="preserve">Le jeu de données est issu de </w:t>
+      </w:r>
+      <w:r>
+        <w:rPr/>
+        <w:t>Kaggle</w:t>
+      </w:r>
+      <w:r>
+        <w:rPr/>
+        <w:t xml:space="preserve"> et les données sources provienn</w:t>
+      </w:r>
+      <w:r>
+        <w:rPr/>
+        <w:t>ent de</w:t>
+      </w:r>
+      <w:r>
+        <w:rPr/>
+        <w:t xml:space="preserve"> </w:t>
+      </w:r>
+      <w:r>
+        <w:rPr/>
+        <w:t>EveryEarthq</w:t>
+      </w:r>
+      <w:r>
+        <w:rPr/>
+        <w:t>uak</w:t>
+      </w:r>
+      <w:r>
+        <w:rPr/>
+        <w:t>e</w:t>
+      </w:r>
+      <w:r>
+        <w:rPr/>
+        <w:t xml:space="preserve"> API</w:t>
+      </w:r>
+      <w:r>
+        <w:rPr/>
+        <w:t xml:space="preserve">. </w:t>
       </w:r>
     </w:p>
     <w:p>
@@ -1104,27 +1911,2154 @@
         <w:spacing w:before="0" w:beforeAutospacing="off" w:after="160" w:afterAutospacing="off" w:line="279" w:lineRule="auto"/>
         <w:ind w:left="0" w:right="0"/>
         <w:jc w:val="left"/>
-      </w:pPr>
-      <w:r>
-        <w:rPr/>
-        <w:t xml:space="preserve">Le jeu de données est issu de </w:t>
-      </w:r>
-      <w:r>
-        <w:rPr/>
-        <w:t>Kaggle</w:t>
-      </w:r>
-      <w:r>
-        <w:rPr/>
-        <w:t xml:space="preserve"> et les données sources proviennent de EveryEarthquake API</w:t>
-      </w:r>
-      <w:r>
-        <w:rPr/>
-        <w:t xml:space="preserve">. </w:t>
-      </w:r>
-    </w:p>
+        <w:rPr>
+          <w:b w:val="1"/>
+          <w:bCs w:val="1"/>
+        </w:rPr>
+      </w:pPr>
+      <w:r>
+        <w:rPr>
+          <w:b w:val="1"/>
+          <w:bCs w:val="1"/>
+        </w:rPr>
+        <w:t>Descrip</w:t>
+      </w:r>
+      <w:r>
+        <w:rPr>
+          <w:b w:val="1"/>
+          <w:bCs w:val="1"/>
+        </w:rPr>
+        <w:t>tion des colonnes :</w:t>
+      </w:r>
+    </w:p>
+    <w:tbl>
+      <w:tblPr>
+        <w:tblStyle w:val="GridTable4-Accent1"/>
+        <w:bidiVisual w:val="0"/>
+        <w:tblW w:w="0" w:type="auto"/>
+        <w:tblLook w:val="0620" w:firstRow="1" w:lastRow="0" w:firstColumn="0" w:lastColumn="0" w:noHBand="1" w:noVBand="1"/>
+      </w:tblPr>
+      <w:tblGrid>
+        <w:gridCol w:w="1470"/>
+        <w:gridCol w:w="5790"/>
+        <w:gridCol w:w="1740"/>
+      </w:tblGrid>
+      <w:tr>
+        <w:trPr>
+          <w:trHeight w:val="300"/>
+        </w:trPr>
+        <w:tc>
+          <w:tcPr>
+            <w:cnfStyle w:val="000000000000" w:firstRow="0" w:lastRow="0" w:firstColumn="0" w:lastColumn="0" w:oddVBand="0" w:evenVBand="0" w:oddHBand="0" w:evenHBand="0" w:firstRowFirstColumn="0" w:firstRowLastColumn="0" w:lastRowFirstColumn="0" w:lastRowLastColumn="0"/>
+            <w:tcW w:w="1470" w:type="dxa"/>
+            <w:tcMar/>
+          </w:tcPr>
+          <w:p>
+            <w:pPr>
+              <w:pStyle w:val="Normal"/>
+              <w:suppressLineNumbers w:val="0"/>
+              <w:bidi w:val="0"/>
+              <w:spacing w:before="0" w:beforeAutospacing="off" w:after="0" w:afterAutospacing="off" w:line="240" w:lineRule="auto"/>
+              <w:ind w:left="0" w:right="0"/>
+              <w:jc w:val="left"/>
+            </w:pPr>
+            <w:r>
+              <w:rPr/>
+              <w:t>Nom</w:t>
+            </w:r>
+          </w:p>
+        </w:tc>
+        <w:tc>
+          <w:tcPr>
+            <w:cnfStyle w:val="000000000000" w:firstRow="0" w:lastRow="0" w:firstColumn="0" w:lastColumn="0" w:oddVBand="0" w:evenVBand="0" w:oddHBand="0" w:evenHBand="0" w:firstRowFirstColumn="0" w:firstRowLastColumn="0" w:lastRowFirstColumn="0" w:lastRowLastColumn="0"/>
+            <w:tcW w:w="5790" w:type="dxa"/>
+            <w:tcMar/>
+          </w:tcPr>
+          <w:p>
+            <w:pPr>
+              <w:pStyle w:val="Normal"/>
+            </w:pPr>
+            <w:r>
+              <w:rPr/>
+              <w:t>Description</w:t>
+            </w:r>
+          </w:p>
+        </w:tc>
+        <w:tc>
+          <w:tcPr>
+            <w:cnfStyle w:val="000000000000" w:firstRow="0" w:lastRow="0" w:firstColumn="0" w:lastColumn="0" w:oddVBand="0" w:evenVBand="0" w:oddHBand="0" w:evenHBand="0" w:firstRowFirstColumn="0" w:firstRowLastColumn="0" w:lastRowFirstColumn="0" w:lastRowLastColumn="0"/>
+            <w:tcW w:w="1740" w:type="dxa"/>
+            <w:tcMar/>
+          </w:tcPr>
+          <w:p>
+            <w:pPr>
+              <w:pStyle w:val="Normal"/>
+            </w:pPr>
+            <w:r>
+              <w:rPr/>
+              <w:t>Type</w:t>
+            </w:r>
+          </w:p>
+        </w:tc>
+      </w:tr>
+      <w:tr>
+        <w:trPr>
+          <w:trHeight w:val="300"/>
+        </w:trPr>
+        <w:tc>
+          <w:tcPr>
+            <w:cnfStyle w:val="000000000000" w:firstRow="0" w:lastRow="0" w:firstColumn="0" w:lastColumn="0" w:oddVBand="0" w:evenVBand="0" w:oddHBand="0" w:evenHBand="0" w:firstRowFirstColumn="0" w:firstRowLastColumn="0" w:lastRowFirstColumn="0" w:lastRowLastColumn="0"/>
+            <w:tcW w:w="1470" w:type="dxa"/>
+            <w:tcMar/>
+          </w:tcPr>
+          <w:p>
+            <w:pPr>
+              <w:pStyle w:val="Normal"/>
+              <w:bidi w:val="0"/>
+              <w:rPr>
+                <w:b w:val="1"/>
+                <w:bCs w:val="1"/>
+                <w:sz w:val="20"/>
+                <w:szCs w:val="20"/>
+              </w:rPr>
+            </w:pPr>
+            <w:r>
+              <w:rPr>
+                <w:b w:val="1"/>
+                <w:bCs w:val="1"/>
+                <w:sz w:val="20"/>
+                <w:szCs w:val="20"/>
+              </w:rPr>
+              <w:t>title</w:t>
+            </w:r>
+          </w:p>
+        </w:tc>
+        <w:tc>
+          <w:tcPr>
+            <w:cnfStyle w:val="000000000000" w:firstRow="0" w:lastRow="0" w:firstColumn="0" w:lastColumn="0" w:oddVBand="0" w:evenVBand="0" w:oddHBand="0" w:evenHBand="0" w:firstRowFirstColumn="0" w:firstRowLastColumn="0" w:lastRowFirstColumn="0" w:lastRowLastColumn="0"/>
+            <w:tcW w:w="5790" w:type="dxa"/>
+            <w:tcMar/>
+          </w:tcPr>
+          <w:p>
+            <w:pPr>
+              <w:pStyle w:val="Normal"/>
+              <w:bidi w:val="0"/>
+              <w:rPr>
+                <w:sz w:val="20"/>
+                <w:szCs w:val="20"/>
+              </w:rPr>
+            </w:pPr>
+            <w:r>
+              <w:rPr>
+                <w:sz w:val="20"/>
+                <w:szCs w:val="20"/>
+              </w:rPr>
+              <w:t>title</w:t>
+            </w:r>
+            <w:r>
+              <w:rPr>
+                <w:sz w:val="20"/>
+                <w:szCs w:val="20"/>
+              </w:rPr>
+              <w:t xml:space="preserve"> </w:t>
+            </w:r>
+            <w:r>
+              <w:rPr>
+                <w:sz w:val="20"/>
+                <w:szCs w:val="20"/>
+              </w:rPr>
+              <w:t>name</w:t>
+            </w:r>
+            <w:r>
+              <w:rPr>
+                <w:sz w:val="20"/>
+                <w:szCs w:val="20"/>
+              </w:rPr>
+              <w:t xml:space="preserve"> </w:t>
+            </w:r>
+            <w:r>
+              <w:rPr>
+                <w:sz w:val="20"/>
+                <w:szCs w:val="20"/>
+              </w:rPr>
+              <w:t>given</w:t>
+            </w:r>
+            <w:r>
+              <w:rPr>
+                <w:sz w:val="20"/>
+                <w:szCs w:val="20"/>
+              </w:rPr>
+              <w:t xml:space="preserve"> to the </w:t>
+            </w:r>
+            <w:r>
+              <w:rPr>
+                <w:sz w:val="20"/>
+                <w:szCs w:val="20"/>
+              </w:rPr>
+              <w:t>earthquake</w:t>
+            </w:r>
+          </w:p>
+        </w:tc>
+        <w:tc>
+          <w:tcPr>
+            <w:cnfStyle w:val="000000000000" w:firstRow="0" w:lastRow="0" w:firstColumn="0" w:lastColumn="0" w:oddVBand="0" w:evenVBand="0" w:oddHBand="0" w:evenHBand="0" w:firstRowFirstColumn="0" w:firstRowLastColumn="0" w:lastRowFirstColumn="0" w:lastRowLastColumn="0"/>
+            <w:tcW w:w="1740" w:type="dxa"/>
+            <w:tcMar/>
+          </w:tcPr>
+          <w:p>
+            <w:pPr>
+              <w:pStyle w:val="Normal"/>
+              <w:bidi w:val="0"/>
+              <w:rPr>
+                <w:sz w:val="20"/>
+                <w:szCs w:val="20"/>
+              </w:rPr>
+            </w:pPr>
+            <w:r>
+              <w:rPr>
+                <w:sz w:val="20"/>
+                <w:szCs w:val="20"/>
+              </w:rPr>
+              <w:t>string</w:t>
+            </w:r>
+          </w:p>
+        </w:tc>
+      </w:tr>
+      <w:tr>
+        <w:trPr>
+          <w:trHeight w:val="300"/>
+        </w:trPr>
+        <w:tc>
+          <w:tcPr>
+            <w:cnfStyle w:val="000000000000" w:firstRow="0" w:lastRow="0" w:firstColumn="0" w:lastColumn="0" w:oddVBand="0" w:evenVBand="0" w:oddHBand="0" w:evenHBand="0" w:firstRowFirstColumn="0" w:firstRowLastColumn="0" w:lastRowFirstColumn="0" w:lastRowLastColumn="0"/>
+            <w:tcW w:w="1470" w:type="dxa"/>
+            <w:tcMar/>
+          </w:tcPr>
+          <w:p>
+            <w:pPr>
+              <w:pStyle w:val="Normal"/>
+              <w:bidi w:val="0"/>
+              <w:rPr>
+                <w:b w:val="1"/>
+                <w:bCs w:val="1"/>
+                <w:sz w:val="20"/>
+                <w:szCs w:val="20"/>
+              </w:rPr>
+            </w:pPr>
+            <w:r>
+              <w:rPr>
+                <w:b w:val="1"/>
+                <w:bCs w:val="1"/>
+                <w:sz w:val="20"/>
+                <w:szCs w:val="20"/>
+              </w:rPr>
+              <w:t>magnitude</w:t>
+            </w:r>
+          </w:p>
+        </w:tc>
+        <w:tc>
+          <w:tcPr>
+            <w:cnfStyle w:val="000000000000" w:firstRow="0" w:lastRow="0" w:firstColumn="0" w:lastColumn="0" w:oddVBand="0" w:evenVBand="0" w:oddHBand="0" w:evenHBand="0" w:firstRowFirstColumn="0" w:firstRowLastColumn="0" w:lastRowFirstColumn="0" w:lastRowLastColumn="0"/>
+            <w:tcW w:w="5790" w:type="dxa"/>
+            <w:tcMar/>
+          </w:tcPr>
+          <w:p>
+            <w:pPr>
+              <w:pStyle w:val="Normal"/>
+              <w:bidi w:val="0"/>
+              <w:rPr>
+                <w:sz w:val="20"/>
+                <w:szCs w:val="20"/>
+              </w:rPr>
+            </w:pPr>
+            <w:r>
+              <w:rPr>
+                <w:sz w:val="20"/>
+                <w:szCs w:val="20"/>
+              </w:rPr>
+              <w:t xml:space="preserve">The magnitude of the </w:t>
+            </w:r>
+            <w:r>
+              <w:rPr>
+                <w:sz w:val="20"/>
+                <w:szCs w:val="20"/>
+              </w:rPr>
+              <w:t>earthquake</w:t>
+            </w:r>
+          </w:p>
+        </w:tc>
+        <w:tc>
+          <w:tcPr>
+            <w:cnfStyle w:val="000000000000" w:firstRow="0" w:lastRow="0" w:firstColumn="0" w:lastColumn="0" w:oddVBand="0" w:evenVBand="0" w:oddHBand="0" w:evenHBand="0" w:firstRowFirstColumn="0" w:firstRowLastColumn="0" w:lastRowFirstColumn="0" w:lastRowLastColumn="0"/>
+            <w:tcW w:w="1740" w:type="dxa"/>
+            <w:tcMar/>
+          </w:tcPr>
+          <w:p>
+            <w:pPr>
+              <w:pStyle w:val="Normal"/>
+              <w:bidi w:val="0"/>
+              <w:rPr>
+                <w:sz w:val="20"/>
+                <w:szCs w:val="20"/>
+              </w:rPr>
+            </w:pPr>
+            <w:r>
+              <w:rPr>
+                <w:sz w:val="20"/>
+                <w:szCs w:val="20"/>
+              </w:rPr>
+              <w:t>float</w:t>
+            </w:r>
+          </w:p>
+        </w:tc>
+      </w:tr>
+      <w:tr>
+        <w:trPr>
+          <w:trHeight w:val="300"/>
+        </w:trPr>
+        <w:tc>
+          <w:tcPr>
+            <w:cnfStyle w:val="000000000000" w:firstRow="0" w:lastRow="0" w:firstColumn="0" w:lastColumn="0" w:oddVBand="0" w:evenVBand="0" w:oddHBand="0" w:evenHBand="0" w:firstRowFirstColumn="0" w:firstRowLastColumn="0" w:lastRowFirstColumn="0" w:lastRowLastColumn="0"/>
+            <w:tcW w:w="1470" w:type="dxa"/>
+            <w:tcMar/>
+          </w:tcPr>
+          <w:p>
+            <w:pPr>
+              <w:pStyle w:val="Normal"/>
+              <w:suppressLineNumbers w:val="0"/>
+              <w:bidi w:val="0"/>
+              <w:rPr>
+                <w:rFonts w:ascii="Aptos" w:hAnsi="Aptos" w:eastAsia="Aptos"/>
+                <w:b w:val="1"/>
+                <w:bCs w:val="1"/>
+                <w:i w:val="0"/>
+                <w:iCs w:val="0"/>
+                <w:caps w:val="0"/>
+                <w:smallCaps w:val="0"/>
+                <w:noProof w:val="0"/>
+                <w:sz w:val="20"/>
+                <w:szCs w:val="20"/>
+                <w:lang w:val="en-US"/>
+              </w:rPr>
+            </w:pPr>
+            <w:r>
+              <w:rPr>
+                <w:rFonts w:ascii="Aptos" w:hAnsi="Aptos" w:eastAsia="Aptos"/>
+                <w:b w:val="1"/>
+                <w:bCs w:val="1"/>
+                <w:i w:val="0"/>
+                <w:iCs w:val="0"/>
+                <w:caps w:val="0"/>
+                <w:smallCaps w:val="0"/>
+                <w:noProof w:val="0"/>
+                <w:sz w:val="20"/>
+                <w:szCs w:val="20"/>
+                <w:lang w:val="en-US"/>
+              </w:rPr>
+              <w:t>date_time</w:t>
+            </w:r>
+          </w:p>
+        </w:tc>
+        <w:tc>
+          <w:tcPr>
+            <w:cnfStyle w:val="000000000000" w:firstRow="0" w:lastRow="0" w:firstColumn="0" w:lastColumn="0" w:oddVBand="0" w:evenVBand="0" w:oddHBand="0" w:evenHBand="0" w:firstRowFirstColumn="0" w:firstRowLastColumn="0" w:lastRowFirstColumn="0" w:lastRowLastColumn="0"/>
+            <w:tcW w:w="5790" w:type="dxa"/>
+            <w:tcMar/>
+          </w:tcPr>
+          <w:p>
+            <w:pPr>
+              <w:pStyle w:val="Normal"/>
+              <w:bidi w:val="0"/>
+              <w:rPr>
+                <w:sz w:val="20"/>
+                <w:szCs w:val="20"/>
+              </w:rPr>
+            </w:pPr>
+            <w:r>
+              <w:rPr>
+                <w:sz w:val="20"/>
+                <w:szCs w:val="20"/>
+              </w:rPr>
+              <w:t>date</w:t>
+            </w:r>
+            <w:r>
+              <w:rPr>
+                <w:sz w:val="20"/>
+                <w:szCs w:val="20"/>
+              </w:rPr>
+              <w:t xml:space="preserve"> and time</w:t>
+            </w:r>
+          </w:p>
+        </w:tc>
+        <w:tc>
+          <w:tcPr>
+            <w:cnfStyle w:val="000000000000" w:firstRow="0" w:lastRow="0" w:firstColumn="0" w:lastColumn="0" w:oddVBand="0" w:evenVBand="0" w:oddHBand="0" w:evenHBand="0" w:firstRowFirstColumn="0" w:firstRowLastColumn="0" w:lastRowFirstColumn="0" w:lastRowLastColumn="0"/>
+            <w:tcW w:w="1740" w:type="dxa"/>
+            <w:tcMar/>
+          </w:tcPr>
+          <w:p>
+            <w:pPr>
+              <w:pStyle w:val="Normal"/>
+              <w:bidi w:val="0"/>
+              <w:rPr>
+                <w:sz w:val="20"/>
+                <w:szCs w:val="20"/>
+              </w:rPr>
+            </w:pPr>
+            <w:r>
+              <w:rPr>
+                <w:sz w:val="20"/>
+                <w:szCs w:val="20"/>
+              </w:rPr>
+              <w:t>datetime</w:t>
+            </w:r>
+          </w:p>
+        </w:tc>
+      </w:tr>
+      <w:tr>
+        <w:trPr>
+          <w:trHeight w:val="300"/>
+        </w:trPr>
+        <w:tc>
+          <w:tcPr>
+            <w:cnfStyle w:val="000000000000" w:firstRow="0" w:lastRow="0" w:firstColumn="0" w:lastColumn="0" w:oddVBand="0" w:evenVBand="0" w:oddHBand="0" w:evenHBand="0" w:firstRowFirstColumn="0" w:firstRowLastColumn="0" w:lastRowFirstColumn="0" w:lastRowLastColumn="0"/>
+            <w:tcW w:w="1470" w:type="dxa"/>
+            <w:tcMar/>
+          </w:tcPr>
+          <w:p>
+            <w:pPr>
+              <w:pStyle w:val="Normal"/>
+              <w:bidi w:val="0"/>
+              <w:rPr>
+                <w:b w:val="1"/>
+                <w:bCs w:val="1"/>
+                <w:sz w:val="20"/>
+                <w:szCs w:val="20"/>
+              </w:rPr>
+            </w:pPr>
+            <w:r>
+              <w:rPr>
+                <w:b w:val="1"/>
+                <w:bCs w:val="1"/>
+                <w:sz w:val="20"/>
+                <w:szCs w:val="20"/>
+              </w:rPr>
+              <w:t>cdi</w:t>
+            </w:r>
+          </w:p>
+        </w:tc>
+        <w:tc>
+          <w:tcPr>
+            <w:cnfStyle w:val="000000000000" w:firstRow="0" w:lastRow="0" w:firstColumn="0" w:lastColumn="0" w:oddVBand="0" w:evenVBand="0" w:oddHBand="0" w:evenHBand="0" w:firstRowFirstColumn="0" w:firstRowLastColumn="0" w:lastRowFirstColumn="0" w:lastRowLastColumn="0"/>
+            <w:tcW w:w="5790" w:type="dxa"/>
+            <w:tcMar/>
+          </w:tcPr>
+          <w:p>
+            <w:pPr>
+              <w:pStyle w:val="Normal"/>
+              <w:bidi w:val="0"/>
+              <w:rPr>
+                <w:sz w:val="20"/>
+                <w:szCs w:val="20"/>
+              </w:rPr>
+            </w:pPr>
+            <w:r>
+              <w:rPr>
+                <w:sz w:val="20"/>
+                <w:szCs w:val="20"/>
+              </w:rPr>
+              <w:t xml:space="preserve">The maximum </w:t>
+            </w:r>
+            <w:r>
+              <w:rPr>
+                <w:sz w:val="20"/>
+                <w:szCs w:val="20"/>
+              </w:rPr>
+              <w:t>reported</w:t>
+            </w:r>
+            <w:r>
+              <w:rPr>
+                <w:sz w:val="20"/>
+                <w:szCs w:val="20"/>
+              </w:rPr>
+              <w:t xml:space="preserve"> </w:t>
+            </w:r>
+            <w:r>
+              <w:rPr>
+                <w:sz w:val="20"/>
+                <w:szCs w:val="20"/>
+              </w:rPr>
+              <w:t>intensity</w:t>
+            </w:r>
+            <w:r>
+              <w:rPr>
+                <w:sz w:val="20"/>
+                <w:szCs w:val="20"/>
+              </w:rPr>
+              <w:t xml:space="preserve"> for the </w:t>
+            </w:r>
+            <w:r>
+              <w:rPr>
+                <w:sz w:val="20"/>
+                <w:szCs w:val="20"/>
+              </w:rPr>
+              <w:t>event</w:t>
+            </w:r>
+            <w:r>
+              <w:rPr>
+                <w:sz w:val="20"/>
+                <w:szCs w:val="20"/>
+              </w:rPr>
+              <w:t xml:space="preserve"> range</w:t>
+            </w:r>
+          </w:p>
+        </w:tc>
+        <w:tc>
+          <w:tcPr>
+            <w:cnfStyle w:val="000000000000" w:firstRow="0" w:lastRow="0" w:firstColumn="0" w:lastColumn="0" w:oddVBand="0" w:evenVBand="0" w:oddHBand="0" w:evenHBand="0" w:firstRowFirstColumn="0" w:firstRowLastColumn="0" w:lastRowFirstColumn="0" w:lastRowLastColumn="0"/>
+            <w:tcW w:w="1740" w:type="dxa"/>
+            <w:tcMar/>
+          </w:tcPr>
+          <w:p>
+            <w:pPr>
+              <w:pStyle w:val="Normal"/>
+              <w:bidi w:val="0"/>
+              <w:rPr>
+                <w:sz w:val="20"/>
+                <w:szCs w:val="20"/>
+              </w:rPr>
+            </w:pPr>
+            <w:r>
+              <w:rPr>
+                <w:sz w:val="20"/>
+                <w:szCs w:val="20"/>
+              </w:rPr>
+              <w:t>int</w:t>
+            </w:r>
+          </w:p>
+        </w:tc>
+      </w:tr>
+      <w:tr>
+        <w:trPr>
+          <w:trHeight w:val="300"/>
+        </w:trPr>
+        <w:tc>
+          <w:tcPr>
+            <w:cnfStyle w:val="000000000000" w:firstRow="0" w:lastRow="0" w:firstColumn="0" w:lastColumn="0" w:oddVBand="0" w:evenVBand="0" w:oddHBand="0" w:evenHBand="0" w:firstRowFirstColumn="0" w:firstRowLastColumn="0" w:lastRowFirstColumn="0" w:lastRowLastColumn="0"/>
+            <w:tcW w:w="1470" w:type="dxa"/>
+            <w:tcMar/>
+          </w:tcPr>
+          <w:p>
+            <w:pPr>
+              <w:pStyle w:val="Normal"/>
+              <w:bidi w:val="0"/>
+              <w:rPr>
+                <w:b w:val="1"/>
+                <w:bCs w:val="1"/>
+                <w:sz w:val="20"/>
+                <w:szCs w:val="20"/>
+              </w:rPr>
+            </w:pPr>
+            <w:r>
+              <w:rPr>
+                <w:b w:val="1"/>
+                <w:bCs w:val="1"/>
+                <w:sz w:val="20"/>
+                <w:szCs w:val="20"/>
+              </w:rPr>
+              <w:t>mmi</w:t>
+            </w:r>
+          </w:p>
+        </w:tc>
+        <w:tc>
+          <w:tcPr>
+            <w:cnfStyle w:val="000000000000" w:firstRow="0" w:lastRow="0" w:firstColumn="0" w:lastColumn="0" w:oddVBand="0" w:evenVBand="0" w:oddHBand="0" w:evenHBand="0" w:firstRowFirstColumn="0" w:firstRowLastColumn="0" w:lastRowFirstColumn="0" w:lastRowLastColumn="0"/>
+            <w:tcW w:w="5790" w:type="dxa"/>
+            <w:tcMar/>
+          </w:tcPr>
+          <w:p>
+            <w:pPr>
+              <w:pStyle w:val="Normal"/>
+              <w:bidi w:val="0"/>
+              <w:rPr>
+                <w:sz w:val="20"/>
+                <w:szCs w:val="20"/>
+              </w:rPr>
+            </w:pPr>
+            <w:r>
+              <w:rPr>
+                <w:sz w:val="20"/>
+                <w:szCs w:val="20"/>
+              </w:rPr>
+              <w:t xml:space="preserve">The maximum </w:t>
+            </w:r>
+            <w:r>
+              <w:rPr>
+                <w:sz w:val="20"/>
+                <w:szCs w:val="20"/>
+              </w:rPr>
+              <w:t>estimated</w:t>
+            </w:r>
+            <w:r>
+              <w:rPr>
+                <w:sz w:val="20"/>
+                <w:szCs w:val="20"/>
+              </w:rPr>
+              <w:t xml:space="preserve"> instrumental </w:t>
+            </w:r>
+            <w:r>
+              <w:rPr>
+                <w:sz w:val="20"/>
+                <w:szCs w:val="20"/>
+              </w:rPr>
+              <w:t>intensity</w:t>
+            </w:r>
+            <w:r>
+              <w:rPr>
+                <w:sz w:val="20"/>
+                <w:szCs w:val="20"/>
+              </w:rPr>
+              <w:t xml:space="preserve"> for the </w:t>
+            </w:r>
+            <w:r>
+              <w:rPr>
+                <w:sz w:val="20"/>
+                <w:szCs w:val="20"/>
+              </w:rPr>
+              <w:t>event</w:t>
+            </w:r>
+          </w:p>
+        </w:tc>
+        <w:tc>
+          <w:tcPr>
+            <w:cnfStyle w:val="000000000000" w:firstRow="0" w:lastRow="0" w:firstColumn="0" w:lastColumn="0" w:oddVBand="0" w:evenVBand="0" w:oddHBand="0" w:evenHBand="0" w:firstRowFirstColumn="0" w:firstRowLastColumn="0" w:lastRowFirstColumn="0" w:lastRowLastColumn="0"/>
+            <w:tcW w:w="1740" w:type="dxa"/>
+            <w:tcMar/>
+          </w:tcPr>
+          <w:p>
+            <w:pPr>
+              <w:pStyle w:val="Normal"/>
+              <w:bidi w:val="0"/>
+              <w:rPr>
+                <w:sz w:val="20"/>
+                <w:szCs w:val="20"/>
+              </w:rPr>
+            </w:pPr>
+            <w:r>
+              <w:rPr>
+                <w:sz w:val="20"/>
+                <w:szCs w:val="20"/>
+              </w:rPr>
+              <w:t>int</w:t>
+            </w:r>
+          </w:p>
+        </w:tc>
+      </w:tr>
+      <w:tr>
+        <w:trPr>
+          <w:trHeight w:val="300"/>
+        </w:trPr>
+        <w:tc>
+          <w:tcPr>
+            <w:cnfStyle w:val="000000000000" w:firstRow="0" w:lastRow="0" w:firstColumn="0" w:lastColumn="0" w:oddVBand="0" w:evenVBand="0" w:oddHBand="0" w:evenHBand="0" w:firstRowFirstColumn="0" w:firstRowLastColumn="0" w:lastRowFirstColumn="0" w:lastRowLastColumn="0"/>
+            <w:tcW w:w="1470" w:type="dxa"/>
+            <w:tcMar/>
+          </w:tcPr>
+          <w:p>
+            <w:pPr>
+              <w:pStyle w:val="Normal"/>
+              <w:suppressLineNumbers w:val="0"/>
+              <w:bidi w:val="0"/>
+              <w:rPr>
+                <w:rFonts w:ascii="Aptos" w:hAnsi="Aptos" w:eastAsia="Aptos"/>
+                <w:b w:val="1"/>
+                <w:bCs w:val="1"/>
+                <w:i w:val="0"/>
+                <w:iCs w:val="0"/>
+                <w:caps w:val="0"/>
+                <w:smallCaps w:val="0"/>
+                <w:noProof w:val="0"/>
+                <w:sz w:val="20"/>
+                <w:szCs w:val="20"/>
+                <w:lang w:val="en-US"/>
+              </w:rPr>
+            </w:pPr>
+            <w:r>
+              <w:rPr>
+                <w:rFonts w:ascii="Aptos" w:hAnsi="Aptos" w:eastAsia="Aptos"/>
+                <w:b w:val="1"/>
+                <w:bCs w:val="1"/>
+                <w:i w:val="0"/>
+                <w:iCs w:val="0"/>
+                <w:caps w:val="0"/>
+                <w:smallCaps w:val="0"/>
+                <w:noProof w:val="0"/>
+                <w:sz w:val="20"/>
+                <w:szCs w:val="20"/>
+                <w:lang w:val="en-US"/>
+              </w:rPr>
+              <w:t>alert</w:t>
+            </w:r>
+          </w:p>
+        </w:tc>
+        <w:tc>
+          <w:tcPr>
+            <w:cnfStyle w:val="000000000000" w:firstRow="0" w:lastRow="0" w:firstColumn="0" w:lastColumn="0" w:oddVBand="0" w:evenVBand="0" w:oddHBand="0" w:evenHBand="0" w:firstRowFirstColumn="0" w:firstRowLastColumn="0" w:lastRowFirstColumn="0" w:lastRowLastColumn="0"/>
+            <w:tcW w:w="5790" w:type="dxa"/>
+            <w:tcMar/>
+          </w:tcPr>
+          <w:p>
+            <w:pPr>
+              <w:pStyle w:val="Normal"/>
+              <w:bidi w:val="0"/>
+              <w:rPr>
+                <w:sz w:val="20"/>
+                <w:szCs w:val="20"/>
+                <w:lang w:val="en-US"/>
+              </w:rPr>
+            </w:pPr>
+            <w:r>
+              <w:rPr>
+                <w:sz w:val="20"/>
+                <w:szCs w:val="20"/>
+                <w:lang w:val="en-US"/>
+              </w:rPr>
+              <w:t>The alert level - “green</w:t>
+            </w:r>
+            <w:r>
+              <w:rPr>
+                <w:sz w:val="20"/>
+                <w:szCs w:val="20"/>
+                <w:lang w:val="en-US"/>
+              </w:rPr>
+              <w:t>”,</w:t>
+            </w:r>
+            <w:r>
+              <w:rPr>
+                <w:sz w:val="20"/>
+                <w:szCs w:val="20"/>
+                <w:lang w:val="en-US"/>
+              </w:rPr>
+              <w:t xml:space="preserve"> “yellow</w:t>
+            </w:r>
+            <w:r>
+              <w:rPr>
+                <w:sz w:val="20"/>
+                <w:szCs w:val="20"/>
+                <w:lang w:val="en-US"/>
+              </w:rPr>
+              <w:t>”,</w:t>
+            </w:r>
+            <w:r>
+              <w:rPr>
+                <w:sz w:val="20"/>
+                <w:szCs w:val="20"/>
+                <w:lang w:val="en-US"/>
+              </w:rPr>
+              <w:t xml:space="preserve"> “orange</w:t>
+            </w:r>
+            <w:r>
+              <w:rPr>
+                <w:sz w:val="20"/>
+                <w:szCs w:val="20"/>
+                <w:lang w:val="en-US"/>
+              </w:rPr>
+              <w:t>”,</w:t>
+            </w:r>
+            <w:r>
+              <w:rPr>
+                <w:sz w:val="20"/>
+                <w:szCs w:val="20"/>
+                <w:lang w:val="en-US"/>
+              </w:rPr>
+              <w:t xml:space="preserve"> and “red”</w:t>
+            </w:r>
+          </w:p>
+        </w:tc>
+        <w:tc>
+          <w:tcPr>
+            <w:cnfStyle w:val="000000000000" w:firstRow="0" w:lastRow="0" w:firstColumn="0" w:lastColumn="0" w:oddVBand="0" w:evenVBand="0" w:oddHBand="0" w:evenHBand="0" w:firstRowFirstColumn="0" w:firstRowLastColumn="0" w:lastRowFirstColumn="0" w:lastRowLastColumn="0"/>
+            <w:tcW w:w="1740" w:type="dxa"/>
+            <w:tcMar/>
+          </w:tcPr>
+          <w:p>
+            <w:pPr>
+              <w:pStyle w:val="Normal"/>
+              <w:bidi w:val="0"/>
+              <w:rPr>
+                <w:sz w:val="20"/>
+                <w:szCs w:val="20"/>
+              </w:rPr>
+            </w:pPr>
+            <w:r>
+              <w:rPr>
+                <w:sz w:val="20"/>
+                <w:szCs w:val="20"/>
+              </w:rPr>
+              <w:t>string</w:t>
+            </w:r>
+          </w:p>
+        </w:tc>
+      </w:tr>
+      <w:tr>
+        <w:trPr>
+          <w:trHeight w:val="300"/>
+        </w:trPr>
+        <w:tc>
+          <w:tcPr>
+            <w:cnfStyle w:val="000000000000" w:firstRow="0" w:lastRow="0" w:firstColumn="0" w:lastColumn="0" w:oddVBand="0" w:evenVBand="0" w:oddHBand="0" w:evenHBand="0" w:firstRowFirstColumn="0" w:firstRowLastColumn="0" w:lastRowFirstColumn="0" w:lastRowLastColumn="0"/>
+            <w:tcW w:w="1470" w:type="dxa"/>
+            <w:tcMar/>
+          </w:tcPr>
+          <w:p>
+            <w:pPr>
+              <w:pStyle w:val="Normal"/>
+              <w:suppressLineNumbers w:val="0"/>
+              <w:bidi w:val="0"/>
+              <w:rPr>
+                <w:rFonts w:ascii="Aptos" w:hAnsi="Aptos" w:eastAsia="Aptos"/>
+                <w:b w:val="1"/>
+                <w:bCs w:val="1"/>
+                <w:i w:val="0"/>
+                <w:iCs w:val="0"/>
+                <w:caps w:val="0"/>
+                <w:smallCaps w:val="0"/>
+                <w:noProof w:val="0"/>
+                <w:sz w:val="20"/>
+                <w:szCs w:val="20"/>
+                <w:lang w:val="en-US"/>
+              </w:rPr>
+            </w:pPr>
+            <w:r>
+              <w:rPr>
+                <w:rFonts w:ascii="Aptos" w:hAnsi="Aptos" w:eastAsia="Aptos"/>
+                <w:b w:val="1"/>
+                <w:bCs w:val="1"/>
+                <w:i w:val="0"/>
+                <w:iCs w:val="0"/>
+                <w:caps w:val="0"/>
+                <w:smallCaps w:val="0"/>
+                <w:noProof w:val="0"/>
+                <w:sz w:val="20"/>
+                <w:szCs w:val="20"/>
+                <w:lang w:val="en-US"/>
+              </w:rPr>
+              <w:t>tsunami</w:t>
+            </w:r>
+          </w:p>
+        </w:tc>
+        <w:tc>
+          <w:tcPr>
+            <w:cnfStyle w:val="000000000000" w:firstRow="0" w:lastRow="0" w:firstColumn="0" w:lastColumn="0" w:oddVBand="0" w:evenVBand="0" w:oddHBand="0" w:evenHBand="0" w:firstRowFirstColumn="0" w:firstRowLastColumn="0" w:lastRowFirstColumn="0" w:lastRowLastColumn="0"/>
+            <w:tcW w:w="5790" w:type="dxa"/>
+            <w:tcMar/>
+          </w:tcPr>
+          <w:p>
+            <w:pPr>
+              <w:pStyle w:val="Normal"/>
+              <w:bidi w:val="0"/>
+              <w:rPr>
+                <w:sz w:val="20"/>
+                <w:szCs w:val="20"/>
+              </w:rPr>
+            </w:pPr>
+            <w:r>
+              <w:rPr>
+                <w:sz w:val="20"/>
+                <w:szCs w:val="20"/>
+              </w:rPr>
+              <w:t>"1" for events in oceanic regions and "0" otherwise</w:t>
+            </w:r>
+          </w:p>
+        </w:tc>
+        <w:tc>
+          <w:tcPr>
+            <w:cnfStyle w:val="000000000000" w:firstRow="0" w:lastRow="0" w:firstColumn="0" w:lastColumn="0" w:oddVBand="0" w:evenVBand="0" w:oddHBand="0" w:evenHBand="0" w:firstRowFirstColumn="0" w:firstRowLastColumn="0" w:lastRowFirstColumn="0" w:lastRowLastColumn="0"/>
+            <w:tcW w:w="1740" w:type="dxa"/>
+            <w:tcMar/>
+          </w:tcPr>
+          <w:p>
+            <w:pPr>
+              <w:pStyle w:val="Normal"/>
+              <w:bidi w:val="0"/>
+              <w:rPr>
+                <w:sz w:val="20"/>
+                <w:szCs w:val="20"/>
+              </w:rPr>
+            </w:pPr>
+            <w:r>
+              <w:rPr>
+                <w:sz w:val="20"/>
+                <w:szCs w:val="20"/>
+              </w:rPr>
+              <w:t>int</w:t>
+            </w:r>
+          </w:p>
+        </w:tc>
+      </w:tr>
+      <w:tr>
+        <w:trPr>
+          <w:trHeight w:val="300"/>
+        </w:trPr>
+        <w:tc>
+          <w:tcPr>
+            <w:cnfStyle w:val="000000000000" w:firstRow="0" w:lastRow="0" w:firstColumn="0" w:lastColumn="0" w:oddVBand="0" w:evenVBand="0" w:oddHBand="0" w:evenHBand="0" w:firstRowFirstColumn="0" w:firstRowLastColumn="0" w:lastRowFirstColumn="0" w:lastRowLastColumn="0"/>
+            <w:tcW w:w="1470" w:type="dxa"/>
+            <w:tcMar/>
+          </w:tcPr>
+          <w:p>
+            <w:pPr>
+              <w:pStyle w:val="Normal"/>
+              <w:suppressLineNumbers w:val="0"/>
+              <w:bidi w:val="0"/>
+              <w:rPr>
+                <w:rFonts w:ascii="Aptos" w:hAnsi="Aptos" w:eastAsia="Aptos"/>
+                <w:b w:val="1"/>
+                <w:bCs w:val="1"/>
+                <w:i w:val="0"/>
+                <w:iCs w:val="0"/>
+                <w:caps w:val="0"/>
+                <w:smallCaps w:val="0"/>
+                <w:noProof w:val="0"/>
+                <w:sz w:val="20"/>
+                <w:szCs w:val="20"/>
+                <w:lang w:val="en-US"/>
+              </w:rPr>
+            </w:pPr>
+            <w:r>
+              <w:rPr>
+                <w:rFonts w:ascii="Aptos" w:hAnsi="Aptos" w:eastAsia="Aptos"/>
+                <w:b w:val="1"/>
+                <w:bCs w:val="1"/>
+                <w:i w:val="0"/>
+                <w:iCs w:val="0"/>
+                <w:caps w:val="0"/>
+                <w:smallCaps w:val="0"/>
+                <w:noProof w:val="0"/>
+                <w:sz w:val="20"/>
+                <w:szCs w:val="20"/>
+                <w:lang w:val="en-US"/>
+              </w:rPr>
+              <w:t>sig</w:t>
+            </w:r>
+          </w:p>
+        </w:tc>
+        <w:tc>
+          <w:tcPr>
+            <w:cnfStyle w:val="000000000000" w:firstRow="0" w:lastRow="0" w:firstColumn="0" w:lastColumn="0" w:oddVBand="0" w:evenVBand="0" w:oddHBand="0" w:evenHBand="0" w:firstRowFirstColumn="0" w:firstRowLastColumn="0" w:lastRowFirstColumn="0" w:lastRowLastColumn="0"/>
+            <w:tcW w:w="5790" w:type="dxa"/>
+            <w:tcMar/>
+          </w:tcPr>
+          <w:p>
+            <w:pPr>
+              <w:pStyle w:val="Normal"/>
+              <w:bidi w:val="0"/>
+              <w:rPr>
+                <w:sz w:val="20"/>
+                <w:szCs w:val="20"/>
+                <w:lang w:val="en-US"/>
+              </w:rPr>
+            </w:pPr>
+            <w:r>
+              <w:rPr>
+                <w:sz w:val="20"/>
+                <w:szCs w:val="20"/>
+                <w:lang w:val="en-US"/>
+              </w:rPr>
+              <w:t xml:space="preserve">A number describing how significant the event is. Larger numbers </w:t>
+            </w:r>
+            <w:r>
+              <w:rPr>
+                <w:sz w:val="20"/>
+                <w:szCs w:val="20"/>
+                <w:lang w:val="en-US"/>
+              </w:rPr>
+              <w:t>indicate</w:t>
+            </w:r>
+            <w:r>
+              <w:rPr>
+                <w:sz w:val="20"/>
+                <w:szCs w:val="20"/>
+                <w:lang w:val="en-US"/>
+              </w:rPr>
+              <w:t xml:space="preserve"> a more significant event. This value is </w:t>
+            </w:r>
+            <w:r>
+              <w:rPr>
+                <w:sz w:val="20"/>
+                <w:szCs w:val="20"/>
+                <w:lang w:val="en-US"/>
+              </w:rPr>
+              <w:t>determined</w:t>
+            </w:r>
+            <w:r>
+              <w:rPr>
+                <w:sz w:val="20"/>
+                <w:szCs w:val="20"/>
+                <w:lang w:val="en-US"/>
+              </w:rPr>
+              <w:t xml:space="preserve"> on </w:t>
+            </w:r>
+            <w:r>
+              <w:rPr>
+                <w:sz w:val="20"/>
+                <w:szCs w:val="20"/>
+                <w:lang w:val="en-US"/>
+              </w:rPr>
+              <w:t>a number of</w:t>
+            </w:r>
+            <w:r>
+              <w:rPr>
+                <w:sz w:val="20"/>
+                <w:szCs w:val="20"/>
+                <w:lang w:val="en-US"/>
+              </w:rPr>
+              <w:t xml:space="preserve"> factors, </w:t>
+            </w:r>
+            <w:r>
+              <w:rPr>
+                <w:sz w:val="20"/>
+                <w:szCs w:val="20"/>
+                <w:lang w:val="en-US"/>
+              </w:rPr>
+              <w:t>including:</w:t>
+            </w:r>
+            <w:r>
+              <w:rPr>
+                <w:sz w:val="20"/>
+                <w:szCs w:val="20"/>
+                <w:lang w:val="en-US"/>
+              </w:rPr>
+              <w:t xml:space="preserve"> </w:t>
+            </w:r>
+            <w:r>
+              <w:rPr>
+                <w:sz w:val="20"/>
+                <w:szCs w:val="20"/>
+                <w:lang w:val="en-US"/>
+              </w:rPr>
+              <w:t>magnitude</w:t>
+            </w:r>
+            <w:r>
+              <w:rPr>
+                <w:sz w:val="20"/>
+                <w:szCs w:val="20"/>
+                <w:lang w:val="en-US"/>
+              </w:rPr>
+              <w:t>, maximum MMI, felt reports, and estimated impact</w:t>
+            </w:r>
+          </w:p>
+        </w:tc>
+        <w:tc>
+          <w:tcPr>
+            <w:cnfStyle w:val="000000000000" w:firstRow="0" w:lastRow="0" w:firstColumn="0" w:lastColumn="0" w:oddVBand="0" w:evenVBand="0" w:oddHBand="0" w:evenHBand="0" w:firstRowFirstColumn="0" w:firstRowLastColumn="0" w:lastRowFirstColumn="0" w:lastRowLastColumn="0"/>
+            <w:tcW w:w="1740" w:type="dxa"/>
+            <w:tcMar/>
+          </w:tcPr>
+          <w:p>
+            <w:pPr>
+              <w:pStyle w:val="Normal"/>
+              <w:bidi w:val="0"/>
+              <w:rPr>
+                <w:sz w:val="20"/>
+                <w:szCs w:val="20"/>
+              </w:rPr>
+            </w:pPr>
+            <w:r>
+              <w:rPr>
+                <w:sz w:val="20"/>
+                <w:szCs w:val="20"/>
+              </w:rPr>
+              <w:t>int</w:t>
+            </w:r>
+          </w:p>
+        </w:tc>
+      </w:tr>
+      <w:tr>
+        <w:trPr>
+          <w:trHeight w:val="300"/>
+        </w:trPr>
+        <w:tc>
+          <w:tcPr>
+            <w:cnfStyle w:val="000000000000" w:firstRow="0" w:lastRow="0" w:firstColumn="0" w:lastColumn="0" w:oddVBand="0" w:evenVBand="0" w:oddHBand="0" w:evenHBand="0" w:firstRowFirstColumn="0" w:firstRowLastColumn="0" w:lastRowFirstColumn="0" w:lastRowLastColumn="0"/>
+            <w:tcW w:w="1470" w:type="dxa"/>
+            <w:tcMar/>
+          </w:tcPr>
+          <w:p>
+            <w:pPr>
+              <w:pStyle w:val="Normal"/>
+              <w:suppressLineNumbers w:val="0"/>
+              <w:bidi w:val="0"/>
+              <w:rPr>
+                <w:rFonts w:ascii="Aptos" w:hAnsi="Aptos" w:eastAsia="Aptos"/>
+                <w:b w:val="1"/>
+                <w:bCs w:val="1"/>
+                <w:i w:val="0"/>
+                <w:iCs w:val="0"/>
+                <w:caps w:val="0"/>
+                <w:smallCaps w:val="0"/>
+                <w:noProof w:val="0"/>
+                <w:sz w:val="20"/>
+                <w:szCs w:val="20"/>
+                <w:lang w:val="en-US"/>
+              </w:rPr>
+            </w:pPr>
+            <w:r>
+              <w:rPr>
+                <w:rFonts w:ascii="Aptos" w:hAnsi="Aptos" w:eastAsia="Aptos"/>
+                <w:b w:val="1"/>
+                <w:bCs w:val="1"/>
+                <w:i w:val="0"/>
+                <w:iCs w:val="0"/>
+                <w:caps w:val="0"/>
+                <w:smallCaps w:val="0"/>
+                <w:noProof w:val="0"/>
+                <w:sz w:val="20"/>
+                <w:szCs w:val="20"/>
+                <w:lang w:val="en-US"/>
+              </w:rPr>
+              <w:t>net</w:t>
+            </w:r>
+          </w:p>
+        </w:tc>
+        <w:tc>
+          <w:tcPr>
+            <w:cnfStyle w:val="000000000000" w:firstRow="0" w:lastRow="0" w:firstColumn="0" w:lastColumn="0" w:oddVBand="0" w:evenVBand="0" w:oddHBand="0" w:evenHBand="0" w:firstRowFirstColumn="0" w:firstRowLastColumn="0" w:lastRowFirstColumn="0" w:lastRowLastColumn="0"/>
+            <w:tcW w:w="5790" w:type="dxa"/>
+            <w:tcMar/>
+          </w:tcPr>
+          <w:p>
+            <w:pPr>
+              <w:pStyle w:val="Normal"/>
+              <w:bidi w:val="0"/>
+              <w:rPr>
+                <w:sz w:val="20"/>
+                <w:szCs w:val="20"/>
+                <w:lang w:val="en-US"/>
+              </w:rPr>
+            </w:pPr>
+            <w:r>
+              <w:rPr>
+                <w:sz w:val="20"/>
+                <w:szCs w:val="20"/>
+                <w:lang w:val="en-US"/>
+              </w:rPr>
+              <w:t xml:space="preserve">The ID of a data contributor. </w:t>
+            </w:r>
+            <w:r>
+              <w:rPr>
+                <w:sz w:val="20"/>
+                <w:szCs w:val="20"/>
+                <w:lang w:val="en-US"/>
+              </w:rPr>
+              <w:t>Identifies</w:t>
+            </w:r>
+            <w:r>
+              <w:rPr>
+                <w:sz w:val="20"/>
+                <w:szCs w:val="20"/>
+                <w:lang w:val="en-US"/>
+              </w:rPr>
+              <w:t xml:space="preserve"> the network considered to be the preferred source of information for this event.</w:t>
+            </w:r>
+          </w:p>
+        </w:tc>
+        <w:tc>
+          <w:tcPr>
+            <w:cnfStyle w:val="000000000000" w:firstRow="0" w:lastRow="0" w:firstColumn="0" w:lastColumn="0" w:oddVBand="0" w:evenVBand="0" w:oddHBand="0" w:evenHBand="0" w:firstRowFirstColumn="0" w:firstRowLastColumn="0" w:lastRowFirstColumn="0" w:lastRowLastColumn="0"/>
+            <w:tcW w:w="1740" w:type="dxa"/>
+            <w:tcMar/>
+          </w:tcPr>
+          <w:p>
+            <w:pPr>
+              <w:pStyle w:val="Normal"/>
+              <w:bidi w:val="0"/>
+              <w:rPr>
+                <w:sz w:val="20"/>
+                <w:szCs w:val="20"/>
+              </w:rPr>
+            </w:pPr>
+            <w:r>
+              <w:rPr>
+                <w:sz w:val="20"/>
+                <w:szCs w:val="20"/>
+              </w:rPr>
+              <w:t>string</w:t>
+            </w:r>
+          </w:p>
+        </w:tc>
+      </w:tr>
+      <w:tr>
+        <w:trPr>
+          <w:trHeight w:val="300"/>
+        </w:trPr>
+        <w:tc>
+          <w:tcPr>
+            <w:cnfStyle w:val="000000000000" w:firstRow="0" w:lastRow="0" w:firstColumn="0" w:lastColumn="0" w:oddVBand="0" w:evenVBand="0" w:oddHBand="0" w:evenHBand="0" w:firstRowFirstColumn="0" w:firstRowLastColumn="0" w:lastRowFirstColumn="0" w:lastRowLastColumn="0"/>
+            <w:tcW w:w="1470" w:type="dxa"/>
+            <w:tcMar/>
+          </w:tcPr>
+          <w:p>
+            <w:pPr>
+              <w:pStyle w:val="Normal"/>
+              <w:suppressLineNumbers w:val="0"/>
+              <w:bidi w:val="0"/>
+              <w:rPr>
+                <w:rFonts w:ascii="Aptos" w:hAnsi="Aptos" w:eastAsia="Aptos"/>
+                <w:b w:val="1"/>
+                <w:bCs w:val="1"/>
+                <w:i w:val="0"/>
+                <w:iCs w:val="0"/>
+                <w:caps w:val="0"/>
+                <w:smallCaps w:val="0"/>
+                <w:noProof w:val="0"/>
+                <w:sz w:val="20"/>
+                <w:szCs w:val="20"/>
+                <w:lang w:val="en-US"/>
+              </w:rPr>
+            </w:pPr>
+            <w:r>
+              <w:rPr>
+                <w:rFonts w:ascii="Aptos" w:hAnsi="Aptos" w:eastAsia="Aptos"/>
+                <w:b w:val="1"/>
+                <w:bCs w:val="1"/>
+                <w:i w:val="0"/>
+                <w:iCs w:val="0"/>
+                <w:caps w:val="0"/>
+                <w:smallCaps w:val="0"/>
+                <w:noProof w:val="0"/>
+                <w:sz w:val="20"/>
+                <w:szCs w:val="20"/>
+                <w:lang w:val="en-US"/>
+              </w:rPr>
+              <w:t>nst</w:t>
+            </w:r>
+          </w:p>
+        </w:tc>
+        <w:tc>
+          <w:tcPr>
+            <w:cnfStyle w:val="000000000000" w:firstRow="0" w:lastRow="0" w:firstColumn="0" w:lastColumn="0" w:oddVBand="0" w:evenVBand="0" w:oddHBand="0" w:evenHBand="0" w:firstRowFirstColumn="0" w:firstRowLastColumn="0" w:lastRowFirstColumn="0" w:lastRowLastColumn="0"/>
+            <w:tcW w:w="5790" w:type="dxa"/>
+            <w:tcMar/>
+          </w:tcPr>
+          <w:p>
+            <w:pPr>
+              <w:pStyle w:val="Normal"/>
+              <w:bidi w:val="0"/>
+              <w:rPr>
+                <w:sz w:val="20"/>
+                <w:szCs w:val="20"/>
+                <w:lang w:val="en-US"/>
+              </w:rPr>
+            </w:pPr>
+            <w:r>
+              <w:rPr>
+                <w:sz w:val="20"/>
+                <w:szCs w:val="20"/>
+                <w:lang w:val="en-US"/>
+              </w:rPr>
+              <w:t xml:space="preserve">The total number of seismic stations used to </w:t>
+            </w:r>
+            <w:r>
+              <w:rPr>
+                <w:sz w:val="20"/>
+                <w:szCs w:val="20"/>
+                <w:lang w:val="en-US"/>
+              </w:rPr>
+              <w:t>determine</w:t>
+            </w:r>
+            <w:r>
+              <w:rPr>
+                <w:sz w:val="20"/>
+                <w:szCs w:val="20"/>
+                <w:lang w:val="en-US"/>
+              </w:rPr>
+              <w:t xml:space="preserve"> earthquake location.</w:t>
+            </w:r>
+          </w:p>
+        </w:tc>
+        <w:tc>
+          <w:tcPr>
+            <w:cnfStyle w:val="000000000000" w:firstRow="0" w:lastRow="0" w:firstColumn="0" w:lastColumn="0" w:oddVBand="0" w:evenVBand="0" w:oddHBand="0" w:evenHBand="0" w:firstRowFirstColumn="0" w:firstRowLastColumn="0" w:lastRowFirstColumn="0" w:lastRowLastColumn="0"/>
+            <w:tcW w:w="1740" w:type="dxa"/>
+            <w:tcMar/>
+          </w:tcPr>
+          <w:p>
+            <w:pPr>
+              <w:pStyle w:val="Normal"/>
+              <w:bidi w:val="0"/>
+              <w:rPr>
+                <w:sz w:val="20"/>
+                <w:szCs w:val="20"/>
+              </w:rPr>
+            </w:pPr>
+            <w:r>
+              <w:rPr>
+                <w:sz w:val="20"/>
+                <w:szCs w:val="20"/>
+              </w:rPr>
+              <w:t>int</w:t>
+            </w:r>
+          </w:p>
+        </w:tc>
+      </w:tr>
+      <w:tr>
+        <w:trPr>
+          <w:trHeight w:val="300"/>
+        </w:trPr>
+        <w:tc>
+          <w:tcPr>
+            <w:cnfStyle w:val="000000000000" w:firstRow="0" w:lastRow="0" w:firstColumn="0" w:lastColumn="0" w:oddVBand="0" w:evenVBand="0" w:oddHBand="0" w:evenHBand="0" w:firstRowFirstColumn="0" w:firstRowLastColumn="0" w:lastRowFirstColumn="0" w:lastRowLastColumn="0"/>
+            <w:tcW w:w="1470" w:type="dxa"/>
+            <w:tcMar/>
+          </w:tcPr>
+          <w:p>
+            <w:pPr>
+              <w:pStyle w:val="Normal"/>
+              <w:suppressLineNumbers w:val="0"/>
+              <w:bidi w:val="0"/>
+              <w:rPr>
+                <w:rFonts w:ascii="Aptos" w:hAnsi="Aptos" w:eastAsia="Aptos"/>
+                <w:b w:val="1"/>
+                <w:bCs w:val="1"/>
+                <w:i w:val="0"/>
+                <w:iCs w:val="0"/>
+                <w:caps w:val="0"/>
+                <w:smallCaps w:val="0"/>
+                <w:noProof w:val="0"/>
+                <w:sz w:val="20"/>
+                <w:szCs w:val="20"/>
+                <w:lang w:val="en-US"/>
+              </w:rPr>
+            </w:pPr>
+            <w:r>
+              <w:rPr>
+                <w:rFonts w:ascii="Aptos" w:hAnsi="Aptos" w:eastAsia="Aptos"/>
+                <w:b w:val="1"/>
+                <w:bCs w:val="1"/>
+                <w:i w:val="0"/>
+                <w:iCs w:val="0"/>
+                <w:caps w:val="0"/>
+                <w:smallCaps w:val="0"/>
+                <w:noProof w:val="0"/>
+                <w:sz w:val="20"/>
+                <w:szCs w:val="20"/>
+                <w:lang w:val="en-US"/>
+              </w:rPr>
+              <w:t>dmin</w:t>
+            </w:r>
+          </w:p>
+        </w:tc>
+        <w:tc>
+          <w:tcPr>
+            <w:cnfStyle w:val="000000000000" w:firstRow="0" w:lastRow="0" w:firstColumn="0" w:lastColumn="0" w:oddVBand="0" w:evenVBand="0" w:oddHBand="0" w:evenHBand="0" w:firstRowFirstColumn="0" w:firstRowLastColumn="0" w:lastRowFirstColumn="0" w:lastRowLastColumn="0"/>
+            <w:tcW w:w="5790" w:type="dxa"/>
+            <w:tcMar/>
+          </w:tcPr>
+          <w:p>
+            <w:pPr>
+              <w:pStyle w:val="Normal"/>
+              <w:bidi w:val="0"/>
+              <w:rPr>
+                <w:sz w:val="20"/>
+                <w:szCs w:val="20"/>
+              </w:rPr>
+            </w:pPr>
+            <w:r>
+              <w:rPr>
+                <w:sz w:val="20"/>
+                <w:szCs w:val="20"/>
+              </w:rPr>
+              <w:t>Horizontal distance from the epicenter to the nearest station</w:t>
+            </w:r>
+          </w:p>
+        </w:tc>
+        <w:tc>
+          <w:tcPr>
+            <w:cnfStyle w:val="000000000000" w:firstRow="0" w:lastRow="0" w:firstColumn="0" w:lastColumn="0" w:oddVBand="0" w:evenVBand="0" w:oddHBand="0" w:evenHBand="0" w:firstRowFirstColumn="0" w:firstRowLastColumn="0" w:lastRowFirstColumn="0" w:lastRowLastColumn="0"/>
+            <w:tcW w:w="1740" w:type="dxa"/>
+            <w:tcMar/>
+          </w:tcPr>
+          <w:p>
+            <w:pPr>
+              <w:pStyle w:val="Normal"/>
+              <w:suppressLineNumbers w:val="0"/>
+              <w:bidi w:val="0"/>
+              <w:spacing w:before="0" w:beforeAutospacing="off" w:after="0" w:afterAutospacing="off" w:line="240" w:lineRule="auto"/>
+              <w:ind w:left="0" w:right="0"/>
+              <w:jc w:val="left"/>
+            </w:pPr>
+            <w:r>
+              <w:rPr>
+                <w:sz w:val="20"/>
+                <w:szCs w:val="20"/>
+              </w:rPr>
+              <w:t>float</w:t>
+            </w:r>
+          </w:p>
+        </w:tc>
+      </w:tr>
+      <w:tr>
+        <w:trPr>
+          <w:trHeight w:val="300"/>
+        </w:trPr>
+        <w:tc>
+          <w:tcPr>
+            <w:cnfStyle w:val="000000000000" w:firstRow="0" w:lastRow="0" w:firstColumn="0" w:lastColumn="0" w:oddVBand="0" w:evenVBand="0" w:oddHBand="0" w:evenHBand="0" w:firstRowFirstColumn="0" w:firstRowLastColumn="0" w:lastRowFirstColumn="0" w:lastRowLastColumn="0"/>
+            <w:tcW w:w="1470" w:type="dxa"/>
+            <w:tcMar/>
+          </w:tcPr>
+          <w:p>
+            <w:pPr>
+              <w:pStyle w:val="Normal"/>
+              <w:suppressLineNumbers w:val="0"/>
+              <w:bidi w:val="0"/>
+              <w:rPr>
+                <w:rFonts w:ascii="Aptos" w:hAnsi="Aptos" w:eastAsia="Aptos"/>
+                <w:b w:val="1"/>
+                <w:bCs w:val="1"/>
+                <w:i w:val="0"/>
+                <w:iCs w:val="0"/>
+                <w:caps w:val="0"/>
+                <w:smallCaps w:val="0"/>
+                <w:noProof w:val="0"/>
+                <w:sz w:val="20"/>
+                <w:szCs w:val="20"/>
+                <w:lang w:val="en-US"/>
+              </w:rPr>
+            </w:pPr>
+            <w:r>
+              <w:rPr>
+                <w:rFonts w:ascii="Aptos" w:hAnsi="Aptos" w:eastAsia="Aptos"/>
+                <w:b w:val="1"/>
+                <w:bCs w:val="1"/>
+                <w:i w:val="0"/>
+                <w:iCs w:val="0"/>
+                <w:caps w:val="0"/>
+                <w:smallCaps w:val="0"/>
+                <w:noProof w:val="0"/>
+                <w:sz w:val="20"/>
+                <w:szCs w:val="20"/>
+                <w:lang w:val="en-US"/>
+              </w:rPr>
+              <w:t>gap</w:t>
+            </w:r>
+          </w:p>
+        </w:tc>
+        <w:tc>
+          <w:tcPr>
+            <w:cnfStyle w:val="000000000000" w:firstRow="0" w:lastRow="0" w:firstColumn="0" w:lastColumn="0" w:oddVBand="0" w:evenVBand="0" w:oddHBand="0" w:evenHBand="0" w:firstRowFirstColumn="0" w:firstRowLastColumn="0" w:lastRowFirstColumn="0" w:lastRowLastColumn="0"/>
+            <w:tcW w:w="5790" w:type="dxa"/>
+            <w:tcMar/>
+          </w:tcPr>
+          <w:p>
+            <w:pPr>
+              <w:pStyle w:val="Normal"/>
+              <w:bidi w:val="0"/>
+              <w:rPr>
+                <w:sz w:val="20"/>
+                <w:szCs w:val="20"/>
+                <w:lang w:val="en-US"/>
+              </w:rPr>
+            </w:pPr>
+            <w:r>
+              <w:rPr>
+                <w:sz w:val="20"/>
+                <w:szCs w:val="20"/>
+                <w:lang w:val="en-US"/>
+              </w:rPr>
+              <w:t xml:space="preserve">The largest azimuthal gap </w:t>
+            </w:r>
+            <w:r>
+              <w:rPr>
+                <w:sz w:val="20"/>
+                <w:szCs w:val="20"/>
+                <w:lang w:val="en-US"/>
+              </w:rPr>
+              <w:t>between azimuthally</w:t>
+            </w:r>
+            <w:r>
+              <w:rPr>
+                <w:sz w:val="20"/>
+                <w:szCs w:val="20"/>
+                <w:lang w:val="en-US"/>
+              </w:rPr>
+              <w:t xml:space="preserve"> adjacent stations (in degrees). In general, the smaller this number, the more reliable is the calculated horizontal position of the earthquake. Earthquake locations in which the azimuthal gap exceeds 180 degrees typically have large location and depth uncertainties</w:t>
+            </w:r>
+          </w:p>
+        </w:tc>
+        <w:tc>
+          <w:tcPr>
+            <w:cnfStyle w:val="000000000000" w:firstRow="0" w:lastRow="0" w:firstColumn="0" w:lastColumn="0" w:oddVBand="0" w:evenVBand="0" w:oddHBand="0" w:evenHBand="0" w:firstRowFirstColumn="0" w:firstRowLastColumn="0" w:lastRowFirstColumn="0" w:lastRowLastColumn="0"/>
+            <w:tcW w:w="1740" w:type="dxa"/>
+            <w:tcMar/>
+          </w:tcPr>
+          <w:p>
+            <w:pPr>
+              <w:pStyle w:val="Normal"/>
+              <w:bidi w:val="0"/>
+              <w:rPr>
+                <w:sz w:val="20"/>
+                <w:szCs w:val="20"/>
+              </w:rPr>
+            </w:pPr>
+            <w:r>
+              <w:rPr>
+                <w:sz w:val="20"/>
+                <w:szCs w:val="20"/>
+              </w:rPr>
+              <w:t>int</w:t>
+            </w:r>
+          </w:p>
+        </w:tc>
+      </w:tr>
+      <w:tr>
+        <w:trPr>
+          <w:trHeight w:val="300"/>
+        </w:trPr>
+        <w:tc>
+          <w:tcPr>
+            <w:cnfStyle w:val="000000000000" w:firstRow="0" w:lastRow="0" w:firstColumn="0" w:lastColumn="0" w:oddVBand="0" w:evenVBand="0" w:oddHBand="0" w:evenHBand="0" w:firstRowFirstColumn="0" w:firstRowLastColumn="0" w:lastRowFirstColumn="0" w:lastRowLastColumn="0"/>
+            <w:tcW w:w="1470" w:type="dxa"/>
+            <w:tcMar/>
+          </w:tcPr>
+          <w:p>
+            <w:pPr>
+              <w:pStyle w:val="Normal"/>
+              <w:suppressLineNumbers w:val="0"/>
+              <w:bidi w:val="0"/>
+              <w:rPr>
+                <w:rFonts w:ascii="Aptos" w:hAnsi="Aptos" w:eastAsia="Aptos"/>
+                <w:b w:val="1"/>
+                <w:bCs w:val="1"/>
+                <w:i w:val="0"/>
+                <w:iCs w:val="0"/>
+                <w:caps w:val="0"/>
+                <w:smallCaps w:val="0"/>
+                <w:noProof w:val="0"/>
+                <w:sz w:val="20"/>
+                <w:szCs w:val="20"/>
+                <w:lang w:val="en-US"/>
+              </w:rPr>
+            </w:pPr>
+            <w:r>
+              <w:rPr>
+                <w:rFonts w:ascii="Aptos" w:hAnsi="Aptos" w:eastAsia="Aptos"/>
+                <w:b w:val="1"/>
+                <w:bCs w:val="1"/>
+                <w:i w:val="0"/>
+                <w:iCs w:val="0"/>
+                <w:caps w:val="0"/>
+                <w:smallCaps w:val="0"/>
+                <w:noProof w:val="0"/>
+                <w:sz w:val="20"/>
+                <w:szCs w:val="20"/>
+                <w:lang w:val="en-US"/>
+              </w:rPr>
+              <w:t>magType</w:t>
+            </w:r>
+          </w:p>
+        </w:tc>
+        <w:tc>
+          <w:tcPr>
+            <w:cnfStyle w:val="000000000000" w:firstRow="0" w:lastRow="0" w:firstColumn="0" w:lastColumn="0" w:oddVBand="0" w:evenVBand="0" w:oddHBand="0" w:evenHBand="0" w:firstRowFirstColumn="0" w:firstRowLastColumn="0" w:lastRowFirstColumn="0" w:lastRowLastColumn="0"/>
+            <w:tcW w:w="5790" w:type="dxa"/>
+            <w:tcMar/>
+          </w:tcPr>
+          <w:p>
+            <w:pPr>
+              <w:pStyle w:val="Normal"/>
+              <w:bidi w:val="0"/>
+              <w:rPr>
+                <w:sz w:val="20"/>
+                <w:szCs w:val="20"/>
+                <w:lang w:val="en-US"/>
+              </w:rPr>
+            </w:pPr>
+            <w:r>
+              <w:rPr>
+                <w:sz w:val="20"/>
+                <w:szCs w:val="20"/>
+                <w:lang w:val="en-US"/>
+              </w:rPr>
+              <w:t xml:space="preserve">The method or algorithm used to calculate the preferred </w:t>
+            </w:r>
+            <w:r>
+              <w:rPr>
+                <w:sz w:val="20"/>
+                <w:szCs w:val="20"/>
+                <w:lang w:val="en-US"/>
+              </w:rPr>
+              <w:t>magnitude</w:t>
+            </w:r>
+            <w:r>
+              <w:rPr>
+                <w:sz w:val="20"/>
+                <w:szCs w:val="20"/>
+                <w:lang w:val="en-US"/>
+              </w:rPr>
+              <w:t xml:space="preserve"> for the event</w:t>
+            </w:r>
+          </w:p>
+        </w:tc>
+        <w:tc>
+          <w:tcPr>
+            <w:cnfStyle w:val="000000000000" w:firstRow="0" w:lastRow="0" w:firstColumn="0" w:lastColumn="0" w:oddVBand="0" w:evenVBand="0" w:oddHBand="0" w:evenHBand="0" w:firstRowFirstColumn="0" w:firstRowLastColumn="0" w:lastRowFirstColumn="0" w:lastRowLastColumn="0"/>
+            <w:tcW w:w="1740" w:type="dxa"/>
+            <w:tcMar/>
+          </w:tcPr>
+          <w:p>
+            <w:pPr>
+              <w:pStyle w:val="Normal"/>
+              <w:bidi w:val="0"/>
+              <w:rPr>
+                <w:sz w:val="20"/>
+                <w:szCs w:val="20"/>
+              </w:rPr>
+            </w:pPr>
+            <w:r>
+              <w:rPr>
+                <w:sz w:val="20"/>
+                <w:szCs w:val="20"/>
+              </w:rPr>
+              <w:t>string</w:t>
+            </w:r>
+          </w:p>
+        </w:tc>
+      </w:tr>
+      <w:tr>
+        <w:trPr>
+          <w:trHeight w:val="300"/>
+        </w:trPr>
+        <w:tc>
+          <w:tcPr>
+            <w:cnfStyle w:val="000000000000" w:firstRow="0" w:lastRow="0" w:firstColumn="0" w:lastColumn="0" w:oddVBand="0" w:evenVBand="0" w:oddHBand="0" w:evenHBand="0" w:firstRowFirstColumn="0" w:firstRowLastColumn="0" w:lastRowFirstColumn="0" w:lastRowLastColumn="0"/>
+            <w:tcW w:w="1470" w:type="dxa"/>
+            <w:tcMar/>
+          </w:tcPr>
+          <w:p>
+            <w:pPr>
+              <w:pStyle w:val="Normal"/>
+              <w:suppressLineNumbers w:val="0"/>
+              <w:bidi w:val="0"/>
+              <w:rPr>
+                <w:rFonts w:ascii="Aptos" w:hAnsi="Aptos" w:eastAsia="Aptos"/>
+                <w:b w:val="1"/>
+                <w:bCs w:val="1"/>
+                <w:i w:val="0"/>
+                <w:iCs w:val="0"/>
+                <w:caps w:val="0"/>
+                <w:smallCaps w:val="0"/>
+                <w:noProof w:val="0"/>
+                <w:sz w:val="20"/>
+                <w:szCs w:val="20"/>
+                <w:lang w:val="fr-FR"/>
+              </w:rPr>
+            </w:pPr>
+            <w:r>
+              <w:rPr>
+                <w:rFonts w:ascii="Aptos" w:hAnsi="Aptos" w:eastAsia="Aptos"/>
+                <w:b w:val="1"/>
+                <w:bCs w:val="1"/>
+                <w:i w:val="0"/>
+                <w:iCs w:val="0"/>
+                <w:caps w:val="0"/>
+                <w:smallCaps w:val="0"/>
+                <w:noProof w:val="0"/>
+                <w:sz w:val="20"/>
+                <w:szCs w:val="20"/>
+                <w:lang w:val="fr-FR"/>
+              </w:rPr>
+              <w:t>depth</w:t>
+            </w:r>
+          </w:p>
+        </w:tc>
+        <w:tc>
+          <w:tcPr>
+            <w:cnfStyle w:val="000000000000" w:firstRow="0" w:lastRow="0" w:firstColumn="0" w:lastColumn="0" w:oddVBand="0" w:evenVBand="0" w:oddHBand="0" w:evenHBand="0" w:firstRowFirstColumn="0" w:firstRowLastColumn="0" w:lastRowFirstColumn="0" w:lastRowLastColumn="0"/>
+            <w:tcW w:w="5790" w:type="dxa"/>
+            <w:tcMar/>
+          </w:tcPr>
+          <w:p>
+            <w:pPr>
+              <w:pStyle w:val="Normal"/>
+              <w:bidi w:val="0"/>
+              <w:rPr>
+                <w:sz w:val="20"/>
+                <w:szCs w:val="20"/>
+                <w:lang w:val="en-US"/>
+              </w:rPr>
+            </w:pPr>
+            <w:r>
+              <w:rPr>
+                <w:sz w:val="20"/>
+                <w:szCs w:val="20"/>
+                <w:lang w:val="en-US"/>
+              </w:rPr>
+              <w:t>The depth where the earthquake begins to rupture</w:t>
+            </w:r>
+          </w:p>
+        </w:tc>
+        <w:tc>
+          <w:tcPr>
+            <w:cnfStyle w:val="000000000000" w:firstRow="0" w:lastRow="0" w:firstColumn="0" w:lastColumn="0" w:oddVBand="0" w:evenVBand="0" w:oddHBand="0" w:evenHBand="0" w:firstRowFirstColumn="0" w:firstRowLastColumn="0" w:lastRowFirstColumn="0" w:lastRowLastColumn="0"/>
+            <w:tcW w:w="1740" w:type="dxa"/>
+            <w:tcMar/>
+          </w:tcPr>
+          <w:p>
+            <w:pPr>
+              <w:pStyle w:val="Normal"/>
+              <w:bidi w:val="0"/>
+              <w:rPr>
+                <w:sz w:val="20"/>
+                <w:szCs w:val="20"/>
+              </w:rPr>
+            </w:pPr>
+            <w:r>
+              <w:rPr>
+                <w:sz w:val="20"/>
+                <w:szCs w:val="20"/>
+              </w:rPr>
+              <w:t>float</w:t>
+            </w:r>
+          </w:p>
+        </w:tc>
+      </w:tr>
+      <w:tr>
+        <w:trPr>
+          <w:trHeight w:val="300"/>
+        </w:trPr>
+        <w:tc>
+          <w:tcPr>
+            <w:cnfStyle w:val="000000000000" w:firstRow="0" w:lastRow="0" w:firstColumn="0" w:lastColumn="0" w:oddVBand="0" w:evenVBand="0" w:oddHBand="0" w:evenHBand="0" w:firstRowFirstColumn="0" w:firstRowLastColumn="0" w:lastRowFirstColumn="0" w:lastRowLastColumn="0"/>
+            <w:tcW w:w="1470" w:type="dxa"/>
+            <w:tcMar/>
+          </w:tcPr>
+          <w:p>
+            <w:pPr>
+              <w:pStyle w:val="Normal"/>
+              <w:bidi w:val="0"/>
+              <w:rPr>
+                <w:rFonts w:ascii="Aptos" w:hAnsi="Aptos" w:eastAsia="Aptos"/>
+                <w:b w:val="1"/>
+                <w:bCs w:val="1"/>
+                <w:i w:val="0"/>
+                <w:iCs w:val="0"/>
+                <w:caps w:val="0"/>
+                <w:smallCaps w:val="0"/>
+                <w:noProof w:val="0"/>
+                <w:sz w:val="20"/>
+                <w:szCs w:val="20"/>
+                <w:lang w:val="en-US"/>
+              </w:rPr>
+            </w:pPr>
+            <w:r>
+              <w:rPr>
+                <w:rFonts w:ascii="Aptos" w:hAnsi="Aptos" w:eastAsia="Aptos"/>
+                <w:b w:val="1"/>
+                <w:bCs w:val="1"/>
+                <w:i w:val="0"/>
+                <w:iCs w:val="0"/>
+                <w:caps w:val="0"/>
+                <w:smallCaps w:val="0"/>
+                <w:noProof w:val="0"/>
+                <w:sz w:val="20"/>
+                <w:szCs w:val="20"/>
+                <w:lang w:val="en-US"/>
+              </w:rPr>
+              <w:t>latitude / longitude</w:t>
+            </w:r>
+          </w:p>
+        </w:tc>
+        <w:tc>
+          <w:tcPr>
+            <w:cnfStyle w:val="000000000000" w:firstRow="0" w:lastRow="0" w:firstColumn="0" w:lastColumn="0" w:oddVBand="0" w:evenVBand="0" w:oddHBand="0" w:evenHBand="0" w:firstRowFirstColumn="0" w:firstRowLastColumn="0" w:lastRowFirstColumn="0" w:lastRowLastColumn="0"/>
+            <w:tcW w:w="5790" w:type="dxa"/>
+            <w:tcMar/>
+          </w:tcPr>
+          <w:p>
+            <w:pPr>
+              <w:pStyle w:val="Normal"/>
+              <w:bidi w:val="0"/>
+              <w:rPr>
+                <w:sz w:val="20"/>
+                <w:szCs w:val="20"/>
+                <w:lang w:val="en-US"/>
+              </w:rPr>
+            </w:pPr>
+            <w:r>
+              <w:rPr>
+                <w:sz w:val="20"/>
+                <w:szCs w:val="20"/>
+                <w:lang w:val="en-US"/>
+              </w:rPr>
+              <w:t xml:space="preserve">coordinate system </w:t>
+            </w:r>
+            <w:r>
+              <w:rPr>
+                <w:sz w:val="20"/>
+                <w:szCs w:val="20"/>
+                <w:lang w:val="en-US"/>
+              </w:rPr>
+              <w:t>by means of</w:t>
+            </w:r>
+            <w:r>
+              <w:rPr>
+                <w:sz w:val="20"/>
+                <w:szCs w:val="20"/>
+                <w:lang w:val="en-US"/>
+              </w:rPr>
+              <w:t xml:space="preserve"> which the position or location of any place on Earth's surface can be </w:t>
+            </w:r>
+            <w:r>
+              <w:rPr>
+                <w:sz w:val="20"/>
+                <w:szCs w:val="20"/>
+                <w:lang w:val="en-US"/>
+              </w:rPr>
+              <w:t>determined</w:t>
+            </w:r>
+            <w:r>
+              <w:rPr>
+                <w:sz w:val="20"/>
+                <w:szCs w:val="20"/>
+                <w:lang w:val="en-US"/>
+              </w:rPr>
+              <w:t xml:space="preserve"> and described</w:t>
+            </w:r>
+          </w:p>
+        </w:tc>
+        <w:tc>
+          <w:tcPr>
+            <w:cnfStyle w:val="000000000000" w:firstRow="0" w:lastRow="0" w:firstColumn="0" w:lastColumn="0" w:oddVBand="0" w:evenVBand="0" w:oddHBand="0" w:evenHBand="0" w:firstRowFirstColumn="0" w:firstRowLastColumn="0" w:lastRowFirstColumn="0" w:lastRowLastColumn="0"/>
+            <w:tcW w:w="1740" w:type="dxa"/>
+            <w:tcMar/>
+          </w:tcPr>
+          <w:p>
+            <w:pPr>
+              <w:pStyle w:val="Normal"/>
+              <w:bidi w:val="0"/>
+              <w:rPr>
+                <w:sz w:val="20"/>
+                <w:szCs w:val="20"/>
+              </w:rPr>
+            </w:pPr>
+            <w:r>
+              <w:rPr>
+                <w:sz w:val="20"/>
+                <w:szCs w:val="20"/>
+              </w:rPr>
+              <w:t>float</w:t>
+            </w:r>
+          </w:p>
+        </w:tc>
+      </w:tr>
+      <w:tr>
+        <w:trPr>
+          <w:trHeight w:val="300"/>
+        </w:trPr>
+        <w:tc>
+          <w:tcPr>
+            <w:cnfStyle w:val="000000000000" w:firstRow="0" w:lastRow="0" w:firstColumn="0" w:lastColumn="0" w:oddVBand="0" w:evenVBand="0" w:oddHBand="0" w:evenHBand="0" w:firstRowFirstColumn="0" w:firstRowLastColumn="0" w:lastRowFirstColumn="0" w:lastRowLastColumn="0"/>
+            <w:tcW w:w="1470" w:type="dxa"/>
+            <w:tcMar/>
+          </w:tcPr>
+          <w:p>
+            <w:pPr>
+              <w:pStyle w:val="Normal"/>
+              <w:suppressLineNumbers w:val="0"/>
+              <w:bidi w:val="0"/>
+              <w:rPr>
+                <w:rFonts w:ascii="Aptos" w:hAnsi="Aptos" w:eastAsia="Aptos"/>
+                <w:b w:val="1"/>
+                <w:bCs w:val="1"/>
+                <w:i w:val="0"/>
+                <w:iCs w:val="0"/>
+                <w:caps w:val="0"/>
+                <w:smallCaps w:val="0"/>
+                <w:noProof w:val="0"/>
+                <w:sz w:val="20"/>
+                <w:szCs w:val="20"/>
+                <w:lang w:val="fr-FR"/>
+              </w:rPr>
+            </w:pPr>
+            <w:r>
+              <w:rPr>
+                <w:rFonts w:ascii="Aptos" w:hAnsi="Aptos" w:eastAsia="Aptos"/>
+                <w:b w:val="1"/>
+                <w:bCs w:val="1"/>
+                <w:i w:val="0"/>
+                <w:iCs w:val="0"/>
+                <w:caps w:val="0"/>
+                <w:smallCaps w:val="0"/>
+                <w:noProof w:val="0"/>
+                <w:sz w:val="20"/>
+                <w:szCs w:val="20"/>
+                <w:lang w:val="fr-FR"/>
+              </w:rPr>
+              <w:t>location</w:t>
+            </w:r>
+          </w:p>
+        </w:tc>
+        <w:tc>
+          <w:tcPr>
+            <w:cnfStyle w:val="000000000000" w:firstRow="0" w:lastRow="0" w:firstColumn="0" w:lastColumn="0" w:oddVBand="0" w:evenVBand="0" w:oddHBand="0" w:evenHBand="0" w:firstRowFirstColumn="0" w:firstRowLastColumn="0" w:lastRowFirstColumn="0" w:lastRowLastColumn="0"/>
+            <w:tcW w:w="5790" w:type="dxa"/>
+            <w:tcMar/>
+          </w:tcPr>
+          <w:p>
+            <w:pPr>
+              <w:pStyle w:val="Normal"/>
+              <w:bidi w:val="0"/>
+              <w:rPr>
+                <w:sz w:val="20"/>
+                <w:szCs w:val="20"/>
+                <w:lang w:val="en-US"/>
+              </w:rPr>
+            </w:pPr>
+            <w:r>
+              <w:rPr>
+                <w:sz w:val="20"/>
+                <w:szCs w:val="20"/>
+                <w:lang w:val="en-US"/>
+              </w:rPr>
+              <w:t>location within the country</w:t>
+            </w:r>
+          </w:p>
+        </w:tc>
+        <w:tc>
+          <w:tcPr>
+            <w:cnfStyle w:val="000000000000" w:firstRow="0" w:lastRow="0" w:firstColumn="0" w:lastColumn="0" w:oddVBand="0" w:evenVBand="0" w:oddHBand="0" w:evenHBand="0" w:firstRowFirstColumn="0" w:firstRowLastColumn="0" w:lastRowFirstColumn="0" w:lastRowLastColumn="0"/>
+            <w:tcW w:w="1740" w:type="dxa"/>
+            <w:tcMar/>
+          </w:tcPr>
+          <w:p>
+            <w:pPr>
+              <w:pStyle w:val="Normal"/>
+              <w:bidi w:val="0"/>
+              <w:rPr>
+                <w:sz w:val="20"/>
+                <w:szCs w:val="20"/>
+              </w:rPr>
+            </w:pPr>
+            <w:r>
+              <w:rPr>
+                <w:sz w:val="20"/>
+                <w:szCs w:val="20"/>
+              </w:rPr>
+              <w:t>string</w:t>
+            </w:r>
+          </w:p>
+        </w:tc>
+      </w:tr>
+      <w:tr>
+        <w:trPr>
+          <w:trHeight w:val="300"/>
+        </w:trPr>
+        <w:tc>
+          <w:tcPr>
+            <w:cnfStyle w:val="000000000000" w:firstRow="0" w:lastRow="0" w:firstColumn="0" w:lastColumn="0" w:oddVBand="0" w:evenVBand="0" w:oddHBand="0" w:evenHBand="0" w:firstRowFirstColumn="0" w:firstRowLastColumn="0" w:lastRowFirstColumn="0" w:lastRowLastColumn="0"/>
+            <w:tcW w:w="1470" w:type="dxa"/>
+            <w:tcMar/>
+          </w:tcPr>
+          <w:p>
+            <w:pPr>
+              <w:pStyle w:val="Normal"/>
+              <w:bidi w:val="0"/>
+              <w:rPr>
+                <w:rFonts w:ascii="Aptos" w:hAnsi="Aptos" w:eastAsia="Aptos"/>
+                <w:b w:val="1"/>
+                <w:bCs w:val="1"/>
+                <w:i w:val="0"/>
+                <w:iCs w:val="0"/>
+                <w:caps w:val="0"/>
+                <w:smallCaps w:val="0"/>
+                <w:noProof w:val="0"/>
+                <w:sz w:val="20"/>
+                <w:szCs w:val="20"/>
+                <w:lang w:val="en-US"/>
+              </w:rPr>
+            </w:pPr>
+            <w:r>
+              <w:rPr>
+                <w:rFonts w:ascii="Aptos" w:hAnsi="Aptos" w:eastAsia="Aptos"/>
+                <w:b w:val="1"/>
+                <w:bCs w:val="1"/>
+                <w:i w:val="0"/>
+                <w:iCs w:val="0"/>
+                <w:caps w:val="0"/>
+                <w:smallCaps w:val="0"/>
+                <w:noProof w:val="0"/>
+                <w:sz w:val="20"/>
+                <w:szCs w:val="20"/>
+                <w:lang w:val="en-US"/>
+              </w:rPr>
+              <w:t>continent</w:t>
+            </w:r>
+          </w:p>
+        </w:tc>
+        <w:tc>
+          <w:tcPr>
+            <w:cnfStyle w:val="000000000000" w:firstRow="0" w:lastRow="0" w:firstColumn="0" w:lastColumn="0" w:oddVBand="0" w:evenVBand="0" w:oddHBand="0" w:evenHBand="0" w:firstRowFirstColumn="0" w:firstRowLastColumn="0" w:lastRowFirstColumn="0" w:lastRowLastColumn="0"/>
+            <w:tcW w:w="5790" w:type="dxa"/>
+            <w:tcMar/>
+          </w:tcPr>
+          <w:p>
+            <w:pPr>
+              <w:pStyle w:val="Normal"/>
+              <w:bidi w:val="0"/>
+              <w:rPr>
+                <w:sz w:val="20"/>
+                <w:szCs w:val="20"/>
+                <w:lang w:val="en-US"/>
+              </w:rPr>
+            </w:pPr>
+            <w:r>
+              <w:rPr>
+                <w:sz w:val="20"/>
+                <w:szCs w:val="20"/>
+                <w:lang w:val="en-US"/>
+              </w:rPr>
+              <w:t>continent of the earthquake hit country</w:t>
+            </w:r>
+          </w:p>
+        </w:tc>
+        <w:tc>
+          <w:tcPr>
+            <w:cnfStyle w:val="000000000000" w:firstRow="0" w:lastRow="0" w:firstColumn="0" w:lastColumn="0" w:oddVBand="0" w:evenVBand="0" w:oddHBand="0" w:evenHBand="0" w:firstRowFirstColumn="0" w:firstRowLastColumn="0" w:lastRowFirstColumn="0" w:lastRowLastColumn="0"/>
+            <w:tcW w:w="1740" w:type="dxa"/>
+            <w:tcMar/>
+          </w:tcPr>
+          <w:p>
+            <w:pPr>
+              <w:pStyle w:val="Normal"/>
+              <w:bidi w:val="0"/>
+              <w:rPr>
+                <w:sz w:val="20"/>
+                <w:szCs w:val="20"/>
+              </w:rPr>
+            </w:pPr>
+            <w:r>
+              <w:rPr>
+                <w:sz w:val="20"/>
+                <w:szCs w:val="20"/>
+              </w:rPr>
+              <w:t>string</w:t>
+            </w:r>
+          </w:p>
+        </w:tc>
+      </w:tr>
+      <w:tr>
+        <w:trPr>
+          <w:trHeight w:val="300"/>
+        </w:trPr>
+        <w:tc>
+          <w:tcPr>
+            <w:cnfStyle w:val="000000000000" w:firstRow="0" w:lastRow="0" w:firstColumn="0" w:lastColumn="0" w:oddVBand="0" w:evenVBand="0" w:oddHBand="0" w:evenHBand="0" w:firstRowFirstColumn="0" w:firstRowLastColumn="0" w:lastRowFirstColumn="0" w:lastRowLastColumn="0"/>
+            <w:tcW w:w="1470" w:type="dxa"/>
+            <w:tcMar/>
+          </w:tcPr>
+          <w:p>
+            <w:pPr>
+              <w:pStyle w:val="Normal"/>
+              <w:bidi w:val="0"/>
+              <w:rPr>
+                <w:rFonts w:ascii="Aptos" w:hAnsi="Aptos" w:eastAsia="Aptos"/>
+                <w:b w:val="1"/>
+                <w:bCs w:val="1"/>
+                <w:i w:val="0"/>
+                <w:iCs w:val="0"/>
+                <w:caps w:val="0"/>
+                <w:smallCaps w:val="0"/>
+                <w:noProof w:val="0"/>
+                <w:sz w:val="20"/>
+                <w:szCs w:val="20"/>
+                <w:lang w:val="en-US"/>
+              </w:rPr>
+            </w:pPr>
+            <w:r>
+              <w:rPr>
+                <w:rFonts w:ascii="Aptos" w:hAnsi="Aptos" w:eastAsia="Aptos"/>
+                <w:b w:val="1"/>
+                <w:bCs w:val="1"/>
+                <w:i w:val="0"/>
+                <w:iCs w:val="0"/>
+                <w:caps w:val="0"/>
+                <w:smallCaps w:val="0"/>
+                <w:noProof w:val="0"/>
+                <w:sz w:val="20"/>
+                <w:szCs w:val="20"/>
+                <w:lang w:val="en-US"/>
+              </w:rPr>
+              <w:t>country</w:t>
+            </w:r>
+          </w:p>
+        </w:tc>
+        <w:tc>
+          <w:tcPr>
+            <w:cnfStyle w:val="000000000000" w:firstRow="0" w:lastRow="0" w:firstColumn="0" w:lastColumn="0" w:oddVBand="0" w:evenVBand="0" w:oddHBand="0" w:evenHBand="0" w:firstRowFirstColumn="0" w:firstRowLastColumn="0" w:lastRowFirstColumn="0" w:lastRowLastColumn="0"/>
+            <w:tcW w:w="5790" w:type="dxa"/>
+            <w:tcMar/>
+          </w:tcPr>
+          <w:p>
+            <w:pPr>
+              <w:pStyle w:val="Normal"/>
+              <w:bidi w:val="0"/>
+              <w:rPr>
+                <w:sz w:val="20"/>
+                <w:szCs w:val="20"/>
+                <w:lang w:val="en-US"/>
+              </w:rPr>
+            </w:pPr>
+            <w:r>
+              <w:rPr>
+                <w:sz w:val="20"/>
+                <w:szCs w:val="20"/>
+                <w:lang w:val="en-US"/>
+              </w:rPr>
+              <w:t>affected country</w:t>
+            </w:r>
+          </w:p>
+        </w:tc>
+        <w:tc>
+          <w:tcPr>
+            <w:cnfStyle w:val="000000000000" w:firstRow="0" w:lastRow="0" w:firstColumn="0" w:lastColumn="0" w:oddVBand="0" w:evenVBand="0" w:oddHBand="0" w:evenHBand="0" w:firstRowFirstColumn="0" w:firstRowLastColumn="0" w:lastRowFirstColumn="0" w:lastRowLastColumn="0"/>
+            <w:tcW w:w="1740" w:type="dxa"/>
+            <w:tcMar/>
+          </w:tcPr>
+          <w:p>
+            <w:pPr>
+              <w:pStyle w:val="Normal"/>
+              <w:bidi w:val="0"/>
+              <w:rPr>
+                <w:sz w:val="20"/>
+                <w:szCs w:val="20"/>
+              </w:rPr>
+            </w:pPr>
+            <w:r>
+              <w:rPr>
+                <w:sz w:val="20"/>
+                <w:szCs w:val="20"/>
+              </w:rPr>
+              <w:t>string</w:t>
+            </w:r>
+          </w:p>
+        </w:tc>
+      </w:tr>
+    </w:tbl>
     <w:p>
       <w:pPr>
         <w:pStyle w:val="Normal"/>
+        <w:suppressLineNumbers w:val="0"/>
+        <w:bidi w:val="0"/>
+        <w:spacing w:before="0" w:beforeAutospacing="off" w:after="160" w:afterAutospacing="off" w:line="279" w:lineRule="auto"/>
+        <w:ind w:left="0" w:right="0"/>
+        <w:jc w:val="left"/>
+      </w:pPr>
+    </w:p>
+    <w:p>
+      <w:pPr>
+        <w:pStyle w:val="Normal"/>
       </w:pPr>
       <w:r>
         <w:rPr/>
@@ -1155,19 +4089,21 @@
       <w:pPr>
         <w:pStyle w:val="Heading2"/>
       </w:pPr>
+      <w:bookmarkStart w:name="_Toc430254373" w:id="1651656919"/>
       <w:r>
         <w:rPr/>
         <w:t>Visualisation des données pour la prédiction du SIG</w:t>
       </w:r>
+      <w:bookmarkEnd w:id="1651656919"/>
     </w:p>
     <w:p>
       <w:pPr>
         <w:pStyle w:val="Normal"/>
-        <w:jc w:val="center"/>
+        <w:jc w:val="left"/>
       </w:pPr>
       <w:r>
         <w:drawing>
-          <wp:inline wp14:editId="199CCFDC" wp14:anchorId="30159967">
+          <wp:inline wp14:editId="594D5645" wp14:anchorId="30159967">
             <wp:extent cx="5724525" cy="5029200"/>
             <wp:effectExtent l="0" t="0" r="0" b="0"/>
             <wp:docPr id="1899244405" name="drawing"/>
@@ -1207,6 +4143,38 @@
             </a:graphic>
           </wp:inline>
         </w:drawing>
+      </w:r>
+      <w:r>
+        <w:rPr/>
+        <w:t>Cette matrice de corrélation nous permet d’identifier un lien de corrélation important entre la cible (SIG)</w:t>
+      </w:r>
+      <w:r>
+        <w:rPr/>
+        <w:t xml:space="preserve"> et certaines des </w:t>
+      </w:r>
+      <w:r>
+        <w:rPr/>
+        <w:t>features</w:t>
+      </w:r>
+      <w:r>
+        <w:rPr/>
+        <w:t xml:space="preserve"> telles que magnitude, cdi et mmi. Ce sont donc des </w:t>
+      </w:r>
+      <w:r>
+        <w:rPr/>
+        <w:t>features</w:t>
+      </w:r>
+      <w:r>
+        <w:rPr/>
+        <w:t xml:space="preserve"> à privilégier dans la </w:t>
+      </w:r>
+      <w:r>
+        <w:rPr/>
+        <w:t>prédiction</w:t>
+      </w:r>
+      <w:r>
+        <w:rPr/>
+        <w:t xml:space="preserve"> du SIG.</w:t>
       </w:r>
     </w:p>
     <w:tbl>
@@ -1410,6 +4378,18 @@
         <w:ind w:left="0" w:right="0"/>
         <w:jc w:val="left"/>
       </w:pPr>
+      <w:r>
+        <w:rPr/>
+        <w:t xml:space="preserve">Ces histogrammes montrent la répartition des </w:t>
+      </w:r>
+      <w:r>
+        <w:rPr/>
+        <w:t>features</w:t>
+      </w:r>
+      <w:r>
+        <w:rPr/>
+        <w:t xml:space="preserve"> les plus corrélées à la cible.</w:t>
+      </w:r>
     </w:p>
     <w:p>
       <w:pPr>
@@ -1419,10 +4399,12 @@
         <w:ind w:left="0" w:right="0"/>
         <w:jc w:val="left"/>
       </w:pPr>
+      <w:bookmarkStart w:name="_Toc616676542" w:id="974357497"/>
       <w:r>
         <w:rPr/>
         <w:t>Visualisation des données pour la prédiction de l’alerte</w:t>
       </w:r>
+      <w:bookmarkEnd w:id="974357497"/>
     </w:p>
     <w:p>
       <w:pPr>
@@ -1434,7 +4416,7 @@
       </w:pPr>
       <w:r>
         <w:drawing>
-          <wp:inline wp14:editId="740AD2F8" wp14:anchorId="213912E1">
+          <wp:inline wp14:editId="1402B82C" wp14:anchorId="213912E1">
             <wp:extent cx="5236971" cy="4809996"/>
             <wp:effectExtent l="0" t="0" r="0" b="0"/>
             <wp:docPr id="295393988" name="drawing"/>
@@ -1475,6 +4457,85 @@
           </wp:inline>
         </w:drawing>
       </w:r>
+    </w:p>
+    <w:p>
+      <w:pPr>
+        <w:pStyle w:val="Normal"/>
+        <w:bidi w:val="0"/>
+        <w:spacing w:before="0" w:beforeAutospacing="off" w:after="160" w:afterAutospacing="off" w:line="279" w:lineRule="auto"/>
+        <w:ind w:left="0" w:right="0"/>
+        <w:jc w:val="left"/>
+      </w:pPr>
+      <w:r>
+        <w:rPr/>
+        <w:t xml:space="preserve">Cette matrice de corrélation permet d’identifier que les </w:t>
+      </w:r>
+      <w:r>
+        <w:rPr/>
+        <w:t>features</w:t>
+      </w:r>
+      <w:r>
+        <w:rPr/>
+        <w:t xml:space="preserve"> </w:t>
+      </w:r>
+      <w:r>
+        <w:rPr/>
+        <w:t>sig</w:t>
+      </w:r>
+      <w:r>
+        <w:rPr/>
+        <w:t xml:space="preserve">, </w:t>
+      </w:r>
+      <w:r>
+        <w:rPr/>
+        <w:t>nst</w:t>
+      </w:r>
+      <w:r>
+        <w:rPr/>
+        <w:t xml:space="preserve">, </w:t>
+      </w:r>
+      <w:r>
+        <w:rPr/>
+        <w:t>dmin</w:t>
+      </w:r>
+      <w:r>
+        <w:rPr/>
+        <w:t>, tsunami mmi et dans un</w:t>
+      </w:r>
+      <w:r>
+        <w:rPr/>
+        <w:t>e moindre mesure cdi ont des corrélations importantes avec les différentes classes de la cible (</w:t>
+      </w:r>
+      <w:r>
+        <w:rPr/>
+        <w:t>alert</w:t>
+      </w:r>
+      <w:r>
+        <w:rPr/>
+        <w:t xml:space="preserve">) après One Hot </w:t>
+      </w:r>
+      <w:r>
+        <w:rPr/>
+        <w:t>Encoding</w:t>
+      </w:r>
+    </w:p>
+    <w:p>
+      <w:pPr>
+        <w:pStyle w:val="Normal"/>
+        <w:bidi w:val="0"/>
+        <w:spacing w:before="0" w:beforeAutospacing="off" w:after="160" w:afterAutospacing="off" w:line="279" w:lineRule="auto"/>
+        <w:ind w:left="0" w:right="0"/>
+        <w:jc w:val="left"/>
+      </w:pPr>
+    </w:p>
+    <w:p>
+      <w:pPr>
+        <w:pStyle w:val="Normal"/>
+        <w:bidi w:val="0"/>
+        <w:spacing w:before="0" w:beforeAutospacing="off" w:after="160" w:afterAutospacing="off" w:line="279" w:lineRule="auto"/>
+        <w:ind w:left="0" w:right="0"/>
+        <w:jc w:val="left"/>
+      </w:pPr>
     </w:p>
     <w:tbl>
       <w:tblPr>
@@ -1689,7 +4750,7 @@
             </w:pPr>
             <w:r>
               <w:drawing>
-                <wp:inline wp14:editId="4346F55F" wp14:anchorId="4A2A4B33">
+                <wp:inline wp14:editId="1D4411AF" wp14:anchorId="4A2A4B33">
                   <wp:extent cx="2367692" cy="1620000"/>
                   <wp:effectExtent l="0" t="0" r="0" b="0"/>
                   <wp:docPr id="891742697" name="drawing"/>
@@ -1740,9 +4801,138 @@
         <w:ind w:left="0"/>
         <w:jc w:val="center"/>
       </w:pPr>
+    </w:p>
+    <w:p>
+      <w:pPr>
+        <w:pStyle w:val="Normal"/>
+        <w:ind w:left="0"/>
+        <w:jc w:val="left"/>
+      </w:pPr>
+      <w:r>
+        <w:rPr/>
+        <w:t xml:space="preserve">Les deux distributions sont très asymétriques. On remarque beaucoup de valeurs de </w:t>
+      </w:r>
+      <w:r>
+        <w:rPr>
+          <w:b w:val="1"/>
+          <w:bCs w:val="1"/>
+        </w:rPr>
+        <w:t>nst</w:t>
+      </w:r>
+      <w:r>
+        <w:rPr>
+          <w:b w:val="1"/>
+          <w:bCs w:val="1"/>
+        </w:rPr>
+        <w:t xml:space="preserve"> </w:t>
+      </w:r>
+      <w:r>
+        <w:rPr/>
+        <w:t>et de</w:t>
+      </w:r>
+      <w:r>
+        <w:rPr/>
+        <w:t xml:space="preserve"> </w:t>
+      </w:r>
+      <w:r>
+        <w:rPr>
+          <w:b w:val="1"/>
+          <w:bCs w:val="1"/>
+        </w:rPr>
+        <w:t>dmin</w:t>
+      </w:r>
+      <w:r>
+        <w:rPr>
+          <w:b w:val="1"/>
+          <w:bCs w:val="1"/>
+        </w:rPr>
+        <w:t xml:space="preserve"> </w:t>
+      </w:r>
+      <w:r>
+        <w:rPr/>
+        <w:t>très faible</w:t>
+      </w:r>
+      <w:r>
+        <w:rPr/>
+        <w:t xml:space="preserve">. </w:t>
+      </w:r>
+    </w:p>
+    <w:p>
+      <w:pPr>
+        <w:pStyle w:val="Normal"/>
+        <w:ind w:left="0"/>
+        <w:jc w:val="left"/>
+      </w:pPr>
+      <w:r>
+        <w:rPr/>
+        <w:t>On peut envisager</w:t>
+      </w:r>
+      <w:r>
+        <w:rPr/>
+        <w:t xml:space="preserve"> :</w:t>
+      </w:r>
+      <w:r>
+        <w:rPr/>
+        <w:t xml:space="preserve"> </w:t>
+      </w:r>
+    </w:p>
+    <w:p>
+      <w:pPr>
+        <w:pStyle w:val="ListParagraph"/>
+        <w:numPr>
+          <w:ilvl w:val="0"/>
+          <w:numId w:val="5"/>
+        </w:numPr>
+        <w:jc w:val="left"/>
+        <w:rPr>
+          <w:sz w:val="24"/>
+          <w:szCs w:val="24"/>
+        </w:rPr>
+      </w:pPr>
+      <w:r>
+        <w:rPr/>
+        <w:t>Une</w:t>
+      </w:r>
+      <w:r>
+        <w:rPr/>
+        <w:t xml:space="preserve"> trans</w:t>
+      </w:r>
+      <w:r>
+        <w:rPr/>
+        <w:t>formation en échelle logarithmique</w:t>
+      </w:r>
+    </w:p>
+    <w:p>
+      <w:pPr>
+        <w:pStyle w:val="ListParagraph"/>
+        <w:numPr>
+          <w:ilvl w:val="0"/>
+          <w:numId w:val="5"/>
+        </w:numPr>
+        <w:jc w:val="left"/>
+        <w:rPr>
+          <w:sz w:val="24"/>
+          <w:szCs w:val="24"/>
+        </w:rPr>
+      </w:pPr>
+      <w:r>
+        <w:rPr/>
+        <w:t xml:space="preserve">Un traitement des </w:t>
+      </w:r>
+      <w:r>
+        <w:rPr/>
+        <w:t>outliers</w:t>
+      </w:r>
+    </w:p>
+    <w:p>
+      <w:pPr>
+        <w:pStyle w:val="Normal"/>
+        <w:ind w:left="0"/>
+        <w:jc w:val="center"/>
+      </w:pPr>
       <w:r>
         <w:drawing>
-          <wp:inline wp14:editId="5F61FDA3" wp14:anchorId="7F190813">
+          <wp:inline wp14:editId="3200C414" wp14:anchorId="7F190813">
             <wp:extent cx="4410075" cy="3019425"/>
             <wp:effectExtent l="0" t="0" r="0" b="0"/>
             <wp:docPr id="1357282158" name="drawing"/>
@@ -1786,17 +4976,498 @@
     </w:p>
     <w:p>
       <w:pPr>
+        <w:pStyle w:val="Normal"/>
+        <w:ind w:left="0"/>
+        <w:jc w:val="left"/>
+      </w:pPr>
+      <w:r>
+        <w:rPr/>
+        <w:t xml:space="preserve">Ces histogrammes donnent la répartition des classes de la cible ainsi que de certaines des </w:t>
+      </w:r>
+      <w:r>
+        <w:rPr/>
+        <w:t>features</w:t>
+      </w:r>
+      <w:r>
+        <w:rPr/>
+        <w:t xml:space="preserve"> qui y </w:t>
+      </w:r>
+      <w:r>
+        <w:rPr/>
+        <w:t>sont</w:t>
+      </w:r>
+      <w:r>
+        <w:rPr/>
+        <w:t xml:space="preserve"> corrélées.</w:t>
+      </w:r>
+    </w:p>
+    <w:p>
+      <w:pPr>
+        <w:pStyle w:val="Normal"/>
+        <w:rPr>
+          <w:rFonts w:ascii="Aptos" w:hAnsi="Aptos" w:eastAsia="Aptos" w:cs="Aptos"/>
+          <w:noProof w:val="0"/>
+          <w:sz w:val="24"/>
+          <w:szCs w:val="24"/>
+          <w:lang w:val="fr-FR"/>
+        </w:rPr>
+      </w:pPr>
+      <w:r>
+        <w:rPr>
+          <w:rFonts w:ascii="Aptos" w:hAnsi="Aptos" w:eastAsia="Aptos" w:cs="Aptos"/>
+          <w:noProof w:val="0"/>
+          <w:sz w:val="24"/>
+          <w:szCs w:val="24"/>
+          <w:lang w:val="fr-FR"/>
+        </w:rPr>
+        <w:t>On remarque que l</w:t>
+      </w:r>
+      <w:r>
+        <w:rPr>
+          <w:rFonts w:ascii="Aptos" w:hAnsi="Aptos" w:eastAsia="Aptos" w:cs="Aptos"/>
+          <w:noProof w:val="0"/>
+          <w:sz w:val="24"/>
+          <w:szCs w:val="24"/>
+          <w:lang w:val="fr-FR"/>
+        </w:rPr>
+        <w:t xml:space="preserve">a répartition est </w:t>
+      </w:r>
+      <w:r>
+        <w:rPr>
+          <w:rFonts w:ascii="Aptos" w:hAnsi="Aptos" w:eastAsia="Aptos" w:cs="Aptos"/>
+          <w:b w:val="1"/>
+          <w:bCs w:val="1"/>
+          <w:noProof w:val="0"/>
+          <w:sz w:val="24"/>
+          <w:szCs w:val="24"/>
+          <w:lang w:val="fr-FR"/>
+        </w:rPr>
+        <w:t>fortement déséquilibrée</w:t>
+      </w:r>
+      <w:r>
+        <w:rPr>
+          <w:rFonts w:ascii="Aptos" w:hAnsi="Aptos" w:eastAsia="Aptos" w:cs="Aptos"/>
+          <w:noProof w:val="0"/>
+          <w:sz w:val="24"/>
+          <w:szCs w:val="24"/>
+          <w:lang w:val="fr-FR"/>
+        </w:rPr>
+        <w:t xml:space="preserve"> : la classe </w:t>
+      </w:r>
+      <w:r>
+        <w:rPr>
+          <w:rFonts w:ascii="Aptos" w:hAnsi="Aptos" w:eastAsia="Aptos" w:cs="Aptos"/>
+          <w:b w:val="1"/>
+          <w:bCs w:val="1"/>
+          <w:noProof w:val="0"/>
+          <w:sz w:val="24"/>
+          <w:szCs w:val="24"/>
+          <w:lang w:val="fr-FR"/>
+        </w:rPr>
+        <w:t>green</w:t>
+      </w:r>
+      <w:r>
+        <w:rPr>
+          <w:rFonts w:ascii="Aptos" w:hAnsi="Aptos" w:eastAsia="Aptos" w:cs="Aptos"/>
+          <w:noProof w:val="0"/>
+          <w:sz w:val="24"/>
+          <w:szCs w:val="24"/>
+          <w:lang w:val="fr-FR"/>
+        </w:rPr>
+        <w:t xml:space="preserve"> domine largement, tand</w:t>
+      </w:r>
+      <w:r>
+        <w:rPr>
+          <w:rFonts w:ascii="Aptos" w:hAnsi="Aptos" w:eastAsia="Aptos" w:cs="Aptos"/>
+          <w:noProof w:val="0"/>
+          <w:sz w:val="24"/>
+          <w:szCs w:val="24"/>
+          <w:lang w:val="fr-FR"/>
+        </w:rPr>
+        <w:t>is que</w:t>
+      </w:r>
+      <w:r>
+        <w:rPr>
+          <w:rFonts w:ascii="Aptos" w:hAnsi="Aptos" w:eastAsia="Aptos" w:cs="Aptos"/>
+          <w:noProof w:val="0"/>
+          <w:sz w:val="24"/>
+          <w:szCs w:val="24"/>
+          <w:lang w:val="fr-FR"/>
+        </w:rPr>
+        <w:t xml:space="preserve"> </w:t>
+      </w:r>
+      <w:r>
+        <w:rPr>
+          <w:rFonts w:ascii="Aptos" w:hAnsi="Aptos" w:eastAsia="Aptos" w:cs="Aptos"/>
+          <w:b w:val="1"/>
+          <w:bCs w:val="1"/>
+          <w:noProof w:val="0"/>
+          <w:sz w:val="24"/>
+          <w:szCs w:val="24"/>
+          <w:lang w:val="fr-FR"/>
+        </w:rPr>
+        <w:t>y</w:t>
+      </w:r>
+      <w:r>
+        <w:rPr>
+          <w:rFonts w:ascii="Aptos" w:hAnsi="Aptos" w:eastAsia="Aptos" w:cs="Aptos"/>
+          <w:b w:val="1"/>
+          <w:bCs w:val="1"/>
+          <w:noProof w:val="0"/>
+          <w:sz w:val="24"/>
+          <w:szCs w:val="24"/>
+          <w:lang w:val="fr-FR"/>
+        </w:rPr>
+        <w:t>ellow</w:t>
+      </w:r>
+      <w:r>
+        <w:rPr>
+          <w:rFonts w:ascii="Aptos" w:hAnsi="Aptos" w:eastAsia="Aptos" w:cs="Aptos"/>
+          <w:noProof w:val="0"/>
+          <w:sz w:val="24"/>
+          <w:szCs w:val="24"/>
+          <w:lang w:val="fr-FR"/>
+        </w:rPr>
+        <w:t>,</w:t>
+      </w:r>
+      <w:r>
+        <w:rPr>
+          <w:rFonts w:ascii="Aptos" w:hAnsi="Aptos" w:eastAsia="Aptos" w:cs="Aptos"/>
+          <w:noProof w:val="0"/>
+          <w:sz w:val="24"/>
+          <w:szCs w:val="24"/>
+          <w:lang w:val="fr-FR"/>
+        </w:rPr>
+        <w:t xml:space="preserve"> </w:t>
+      </w:r>
+      <w:r>
+        <w:rPr>
+          <w:rFonts w:ascii="Aptos" w:hAnsi="Aptos" w:eastAsia="Aptos" w:cs="Aptos"/>
+          <w:b w:val="1"/>
+          <w:bCs w:val="1"/>
+          <w:noProof w:val="0"/>
+          <w:sz w:val="24"/>
+          <w:szCs w:val="24"/>
+          <w:lang w:val="fr-FR"/>
+        </w:rPr>
+        <w:t>orange</w:t>
+      </w:r>
+      <w:r>
+        <w:rPr>
+          <w:rFonts w:ascii="Aptos" w:hAnsi="Aptos" w:eastAsia="Aptos" w:cs="Aptos"/>
+          <w:noProof w:val="0"/>
+          <w:sz w:val="24"/>
+          <w:szCs w:val="24"/>
+          <w:lang w:val="fr-FR"/>
+        </w:rPr>
+        <w:t xml:space="preserve"> et s</w:t>
+      </w:r>
+      <w:r>
+        <w:rPr>
+          <w:rFonts w:ascii="Aptos" w:hAnsi="Aptos" w:eastAsia="Aptos" w:cs="Aptos"/>
+          <w:noProof w:val="0"/>
+          <w:sz w:val="24"/>
+          <w:szCs w:val="24"/>
+          <w:lang w:val="fr-FR"/>
+        </w:rPr>
+        <w:t>urt</w:t>
+      </w:r>
+      <w:r>
+        <w:rPr>
+          <w:rFonts w:ascii="Aptos" w:hAnsi="Aptos" w:eastAsia="Aptos" w:cs="Aptos"/>
+          <w:noProof w:val="0"/>
+          <w:sz w:val="24"/>
+          <w:szCs w:val="24"/>
+          <w:lang w:val="fr-FR"/>
+        </w:rPr>
+        <w:t xml:space="preserve">out </w:t>
+      </w:r>
+      <w:r>
+        <w:rPr>
+          <w:rFonts w:ascii="Aptos" w:hAnsi="Aptos" w:eastAsia="Aptos" w:cs="Aptos"/>
+          <w:b w:val="1"/>
+          <w:bCs w:val="1"/>
+          <w:noProof w:val="0"/>
+          <w:sz w:val="24"/>
+          <w:szCs w:val="24"/>
+          <w:lang w:val="fr-FR"/>
+        </w:rPr>
+        <w:t>r</w:t>
+      </w:r>
+      <w:r>
+        <w:rPr>
+          <w:rFonts w:ascii="Aptos" w:hAnsi="Aptos" w:eastAsia="Aptos" w:cs="Aptos"/>
+          <w:b w:val="1"/>
+          <w:bCs w:val="1"/>
+          <w:noProof w:val="0"/>
+          <w:sz w:val="24"/>
+          <w:szCs w:val="24"/>
+          <w:lang w:val="fr-FR"/>
+        </w:rPr>
+        <w:t>ed</w:t>
+      </w:r>
+      <w:r>
+        <w:rPr>
+          <w:rFonts w:ascii="Aptos" w:hAnsi="Aptos" w:eastAsia="Aptos" w:cs="Aptos"/>
+          <w:noProof w:val="0"/>
+          <w:sz w:val="24"/>
+          <w:szCs w:val="24"/>
+          <w:lang w:val="fr-FR"/>
+        </w:rPr>
+        <w:t xml:space="preserve"> </w:t>
+      </w:r>
+      <w:r>
+        <w:rPr>
+          <w:rFonts w:ascii="Aptos" w:hAnsi="Aptos" w:eastAsia="Aptos" w:cs="Aptos"/>
+          <w:noProof w:val="0"/>
+          <w:sz w:val="24"/>
+          <w:szCs w:val="24"/>
+          <w:lang w:val="fr-FR"/>
+        </w:rPr>
+        <w:t xml:space="preserve">sont beaucoup plus rares, ce qui peut biaiser l’apprentissage du modèle vers la prédiction de </w:t>
+      </w:r>
+      <w:r>
+        <w:rPr>
+          <w:rFonts w:ascii="Aptos" w:hAnsi="Aptos" w:eastAsia="Aptos" w:cs="Aptos"/>
+          <w:i w:val="1"/>
+          <w:iCs w:val="1"/>
+          <w:noProof w:val="0"/>
+          <w:sz w:val="24"/>
+          <w:szCs w:val="24"/>
+          <w:lang w:val="fr-FR"/>
+        </w:rPr>
+        <w:t>green</w:t>
+      </w:r>
+      <w:r>
+        <w:rPr>
+          <w:rFonts w:ascii="Aptos" w:hAnsi="Aptos" w:eastAsia="Aptos" w:cs="Aptos"/>
+          <w:noProof w:val="0"/>
+          <w:sz w:val="24"/>
+          <w:szCs w:val="24"/>
+          <w:lang w:val="fr-FR"/>
+        </w:rPr>
+        <w:t xml:space="preserve"> et nécessite une gestion du </w:t>
+      </w:r>
+      <w:r>
+        <w:rPr>
+          <w:rFonts w:ascii="Aptos" w:hAnsi="Aptos" w:eastAsia="Aptos" w:cs="Aptos"/>
+          <w:noProof w:val="0"/>
+          <w:sz w:val="24"/>
+          <w:szCs w:val="24"/>
+          <w:lang w:val="fr-FR"/>
+        </w:rPr>
+        <w:t>déséquilibre :</w:t>
+      </w:r>
+    </w:p>
+    <w:p>
+      <w:pPr>
+        <w:pStyle w:val="Normal"/>
+        <w:rPr>
+          <w:rFonts w:ascii="Aptos" w:hAnsi="Aptos" w:eastAsia="Aptos" w:cs="Aptos"/>
+          <w:noProof w:val="0"/>
+          <w:sz w:val="24"/>
+          <w:szCs w:val="24"/>
+          <w:lang w:val="fr-FR"/>
+        </w:rPr>
+      </w:pPr>
+      <w:r>
+        <w:rPr>
+          <w:rFonts w:ascii="Aptos" w:hAnsi="Aptos" w:eastAsia="Aptos" w:cs="Aptos"/>
+          <w:noProof w:val="0"/>
+          <w:sz w:val="24"/>
+          <w:szCs w:val="24"/>
+          <w:u w:val="single"/>
+          <w:lang w:val="fr-FR"/>
+        </w:rPr>
+        <w:t>Pondération</w:t>
+      </w:r>
+      <w:r>
+        <w:rPr>
+          <w:rFonts w:ascii="Aptos" w:hAnsi="Aptos" w:eastAsia="Aptos" w:cs="Aptos"/>
+          <w:noProof w:val="0"/>
+          <w:sz w:val="24"/>
+          <w:szCs w:val="24"/>
+          <w:u w:val="single"/>
+          <w:lang w:val="fr-FR"/>
+        </w:rPr>
+        <w:t xml:space="preserve"> </w:t>
+      </w:r>
+      <w:r>
+        <w:rPr>
+          <w:rFonts w:ascii="Aptos" w:hAnsi="Aptos" w:eastAsia="Aptos" w:cs="Aptos"/>
+          <w:noProof w:val="0"/>
+          <w:sz w:val="24"/>
+          <w:szCs w:val="24"/>
+          <w:u w:val="single"/>
+          <w:lang w:val="fr-FR"/>
+        </w:rPr>
+        <w:t>des classes</w:t>
+      </w:r>
+      <w:r>
+        <w:rPr>
+          <w:rFonts w:ascii="Aptos" w:hAnsi="Aptos" w:eastAsia="Aptos" w:cs="Aptos"/>
+          <w:noProof w:val="0"/>
+          <w:sz w:val="24"/>
+          <w:szCs w:val="24"/>
+          <w:lang w:val="fr-FR"/>
+        </w:rPr>
+        <w:t xml:space="preserve"> : on pénalise d’avantage les erreurs sur les classes rares (</w:t>
+      </w:r>
+      <w:r>
+        <w:rPr>
+          <w:rFonts w:ascii="Aptos" w:hAnsi="Aptos" w:eastAsia="Aptos" w:cs="Aptos"/>
+          <w:noProof w:val="0"/>
+          <w:sz w:val="24"/>
+          <w:szCs w:val="24"/>
+          <w:lang w:val="fr-FR"/>
+        </w:rPr>
+        <w:t>yell</w:t>
+      </w:r>
+      <w:r>
+        <w:rPr>
+          <w:rFonts w:ascii="Aptos" w:hAnsi="Aptos" w:eastAsia="Aptos" w:cs="Aptos"/>
+          <w:noProof w:val="0"/>
+          <w:sz w:val="24"/>
+          <w:szCs w:val="24"/>
+          <w:lang w:val="fr-FR"/>
+        </w:rPr>
+        <w:t>ow</w:t>
+      </w:r>
+      <w:r>
+        <w:rPr>
+          <w:rFonts w:ascii="Aptos" w:hAnsi="Aptos" w:eastAsia="Aptos" w:cs="Aptos"/>
+          <w:noProof w:val="0"/>
+          <w:sz w:val="24"/>
+          <w:szCs w:val="24"/>
+          <w:lang w:val="fr-FR"/>
+        </w:rPr>
+        <w:t>, or</w:t>
+      </w:r>
+      <w:r>
+        <w:rPr>
+          <w:rFonts w:ascii="Aptos" w:hAnsi="Aptos" w:eastAsia="Aptos" w:cs="Aptos"/>
+          <w:noProof w:val="0"/>
+          <w:sz w:val="24"/>
+          <w:szCs w:val="24"/>
+          <w:lang w:val="fr-FR"/>
+        </w:rPr>
+        <w:t xml:space="preserve">ange et </w:t>
+      </w:r>
+      <w:r>
+        <w:rPr>
+          <w:rFonts w:ascii="Aptos" w:hAnsi="Aptos" w:eastAsia="Aptos" w:cs="Aptos"/>
+          <w:noProof w:val="0"/>
+          <w:sz w:val="24"/>
+          <w:szCs w:val="24"/>
+          <w:lang w:val="fr-FR"/>
+        </w:rPr>
+        <w:t>red</w:t>
+      </w:r>
+      <w:r>
+        <w:rPr>
+          <w:rFonts w:ascii="Aptos" w:hAnsi="Aptos" w:eastAsia="Aptos" w:cs="Aptos"/>
+          <w:noProof w:val="0"/>
+          <w:sz w:val="24"/>
+          <w:szCs w:val="24"/>
+          <w:lang w:val="fr-FR"/>
+        </w:rPr>
+        <w:t>)</w:t>
+      </w:r>
+      <w:r>
+        <w:rPr>
+          <w:rFonts w:ascii="Aptos" w:hAnsi="Aptos" w:eastAsia="Aptos" w:cs="Aptos"/>
+          <w:noProof w:val="0"/>
+          <w:sz w:val="24"/>
+          <w:szCs w:val="24"/>
+          <w:lang w:val="fr-FR"/>
+        </w:rPr>
+        <w:t xml:space="preserve"> </w:t>
+      </w:r>
+    </w:p>
+    <w:p>
+      <w:pPr>
+        <w:pStyle w:val="Normal"/>
+        <w:rPr>
+          <w:rFonts w:ascii="Aptos" w:hAnsi="Aptos" w:eastAsia="Aptos" w:cs="Aptos"/>
+          <w:noProof w:val="0"/>
+          <w:sz w:val="24"/>
+          <w:szCs w:val="24"/>
+          <w:lang w:val="fr-FR"/>
+        </w:rPr>
+      </w:pPr>
+      <w:r>
+        <w:rPr>
+          <w:rFonts w:ascii="Aptos" w:hAnsi="Aptos" w:eastAsia="Aptos" w:cs="Aptos"/>
+          <w:noProof w:val="0"/>
+          <w:sz w:val="24"/>
+          <w:szCs w:val="24"/>
+          <w:u w:val="single"/>
+          <w:lang w:val="fr-FR"/>
+        </w:rPr>
+        <w:t>Métriques</w:t>
+      </w:r>
+      <w:r>
+        <w:rPr>
+          <w:rFonts w:ascii="Aptos" w:hAnsi="Aptos" w:eastAsia="Aptos" w:cs="Aptos"/>
+          <w:noProof w:val="0"/>
+          <w:sz w:val="24"/>
+          <w:szCs w:val="24"/>
+          <w:u w:val="single"/>
+          <w:lang w:val="fr-FR"/>
+        </w:rPr>
+        <w:t xml:space="preserve"> type F1-macro</w:t>
+      </w:r>
+      <w:r>
+        <w:rPr>
+          <w:rFonts w:ascii="Aptos" w:hAnsi="Aptos" w:eastAsia="Aptos" w:cs="Aptos"/>
+          <w:noProof w:val="0"/>
+          <w:sz w:val="24"/>
+          <w:szCs w:val="24"/>
+          <w:lang w:val="fr-FR"/>
+        </w:rPr>
+        <w:t xml:space="preserve"> : </w:t>
+      </w:r>
+      <w:r>
+        <w:rPr>
+          <w:rFonts w:ascii="Aptos" w:hAnsi="Aptos" w:eastAsia="Aptos" w:cs="Aptos"/>
+          <w:noProof w:val="0"/>
+          <w:sz w:val="24"/>
+          <w:szCs w:val="24"/>
+          <w:lang w:val="fr-FR"/>
+        </w:rPr>
+        <w:t xml:space="preserve">on donne le même </w:t>
+      </w:r>
+      <w:r>
+        <w:rPr>
+          <w:rFonts w:ascii="Aptos" w:hAnsi="Aptos" w:eastAsia="Aptos" w:cs="Aptos"/>
+          <w:noProof w:val="0"/>
+          <w:sz w:val="24"/>
+          <w:szCs w:val="24"/>
+          <w:lang w:val="fr-FR"/>
+        </w:rPr>
+        <w:t>poids</w:t>
+      </w:r>
+      <w:r>
+        <w:rPr>
+          <w:rFonts w:ascii="Aptos" w:hAnsi="Aptos" w:eastAsia="Aptos" w:cs="Aptos"/>
+          <w:noProof w:val="0"/>
+          <w:sz w:val="24"/>
+          <w:szCs w:val="24"/>
+          <w:lang w:val="fr-FR"/>
+        </w:rPr>
+        <w:t xml:space="preserve"> à chaque classe.</w:t>
+      </w:r>
+    </w:p>
+    <w:p>
+      <w:pPr>
         <w:pStyle w:val="Heading2"/>
       </w:pPr>
-    </w:p>
-    <w:p>
-      <w:pPr>
-        <w:pStyle w:val="Heading2"/>
-      </w:pPr>
+      <w:bookmarkStart w:name="_Toc276126750" w:id="307383665"/>
       <w:r>
         <w:rPr/>
         <w:t>Pré-traitement des données</w:t>
       </w:r>
+      <w:bookmarkEnd w:id="307383665"/>
     </w:p>
     <w:p>
       <w:pPr>
@@ -2120,21 +5791,23 @@
       <w:pPr>
         <w:pStyle w:val="Heading1"/>
       </w:pPr>
-      <w:bookmarkStart w:name="_Toc1406988185" w:id="78889630"/>
+      <w:bookmarkStart w:name="_Toc1610812612" w:id="1633403686"/>
       <w:r>
         <w:rPr/>
         <w:t>Modèles</w:t>
       </w:r>
-      <w:bookmarkEnd w:id="78889630"/>
+      <w:bookmarkEnd w:id="1633403686"/>
     </w:p>
     <w:p>
       <w:pPr>
         <w:pStyle w:val="Heading2"/>
       </w:pPr>
+      <w:bookmarkStart w:name="_Toc1542514101" w:id="766009902"/>
       <w:r>
         <w:rPr/>
         <w:t>Prédiction de l’alerte</w:t>
       </w:r>
+      <w:bookmarkEnd w:id="766009902"/>
     </w:p>
     <w:p>
       <w:pPr>
@@ -3114,14 +6787,20 @@
         <w:ind w:left="0" w:right="0"/>
         <w:jc w:val="left"/>
       </w:pPr>
-      <w:r>
-        <w:rPr/>
-        <w:t>Model c</w:t>
+      <w:bookmarkStart w:name="_Toc139627773" w:id="211881811"/>
+      <w:r>
+        <w:rPr/>
+        <w:t xml:space="preserve">Model </w:t>
+      </w:r>
+      <w:r>
+        <w:rPr/>
+        <w:t>c</w:t>
       </w:r>
       <w:r>
         <w:rPr/>
         <w:t>ards</w:t>
       </w:r>
+      <w:bookmarkEnd w:id="211881811"/>
     </w:p>
     <w:p>
       <w:pPr>
@@ -3255,7 +6934,7 @@
         <w:rPr/>
         <w:t xml:space="preserve"> peut être trouvé ici : </w:t>
       </w:r>
-      <w:hyperlink r:id="R978022f547004552">
+      <w:hyperlink r:id="Rc5df3b9997ed4cb8">
         <w:r>
           <w:rPr>
             <w:rStyle w:val="Hyperlink"/>
@@ -3267,7 +6946,51 @@
     <w:p>
       <w:pPr>
         <w:pStyle w:val="Normal"/>
-      </w:pPr>
+        <w:rPr>
+          <w:sz w:val="24"/>
+          <w:szCs w:val="24"/>
+        </w:rPr>
+      </w:pPr>
+    </w:p>
+    <w:p>
+      <w:pPr>
+        <w:pStyle w:val="Heading1"/>
+      </w:pPr>
+      <w:bookmarkStart w:name="_Toc222574100" w:id="1711740879"/>
+      <w:r>
+        <w:rPr/>
+        <w:t>Conclusion et perspectives</w:t>
+      </w:r>
+      <w:bookmarkEnd w:id="1711740879"/>
+    </w:p>
+    <w:p>
+      <w:pPr>
+        <w:pStyle w:val="Normal"/>
+      </w:pPr>
+      <w:r>
+        <w:rPr/>
+        <w:t>Les perspectives d’amélioration du projet seraient de rendre le projet industrialisable</w:t>
+      </w:r>
+      <w:r>
+        <w:rPr/>
+        <w:t xml:space="preserve"> et le rendre prêt pour une mise en production</w:t>
+      </w:r>
+      <w:r>
+        <w:rPr/>
+        <w:t>. Pour se faire</w:t>
+      </w:r>
+      <w:r>
+        <w:rPr/>
+        <w:t xml:space="preserve">, </w:t>
+      </w:r>
+      <w:r>
+        <w:rPr/>
+        <w:t>mettre en place du monitoring, transformer les notebooks en script et créer des pipelines</w:t>
+      </w:r>
+      <w:r>
+        <w:rPr/>
+        <w:t xml:space="preserve">. </w:t>
+      </w:r>
     </w:p>
     <w:sectPr>
       <w:pgSz w:w="11906" w:h="16838" w:orient="portrait"/>
@@ -3578,6 +7301,342 @@
 
 <file path=word/numbering.xml><?xml version="1.0" encoding="utf-8"?>
 <w:numbering xmlns:w="http://schemas.openxmlformats.org/wordprocessingml/2006/main">
+  <w:abstractNum xmlns:w="http://schemas.openxmlformats.org/wordprocessingml/2006/main" w:abstractNumId="6">
+    <w:nsid w:val="47ef8beb"/>
+    <w:multiLevelType xmlns:w="http://schemas.openxmlformats.org/wordprocessingml/2006/main" w:val="hybridMultilevel"/>
+    <w:lvl xmlns:w="http://schemas.openxmlformats.org/wordprocessingml/2006/main" w:ilvl="0">
+      <w:start w:val="1"/>
+      <w:numFmt w:val="bullet"/>
+      <w:lvlText w:val=""/>
+      <w:lvlJc w:val="left"/>
+      <w:pPr>
+        <w:ind w:left="720" w:hanging="360"/>
+      </w:pPr>
+      <w:rPr>
+        <w:rFonts w:hint="default" w:ascii="Symbol" w:hAnsi="Symbol"/>
+      </w:rPr>
+    </w:lvl>
+    <w:lvl xmlns:w="http://schemas.openxmlformats.org/wordprocessingml/2006/main" w:ilvl="1">
+      <w:start w:val="1"/>
+      <w:numFmt w:val="bullet"/>
+      <w:lvlText w:val="o"/>
+      <w:lvlJc w:val="left"/>
+      <w:pPr>
+        <w:ind w:left="1440" w:hanging="360"/>
+      </w:pPr>
+      <w:rPr>
+        <w:rFonts w:hint="default" w:ascii="Courier New" w:hAnsi="Courier New"/>
+      </w:rPr>
+    </w:lvl>
+    <w:lvl xmlns:w="http://schemas.openxmlformats.org/wordprocessingml/2006/main" w:ilvl="2">
+      <w:start w:val="1"/>
+      <w:numFmt w:val="bullet"/>
+      <w:lvlText w:val=""/>
+      <w:lvlJc w:val="left"/>
+      <w:pPr>
+        <w:ind w:left="2160" w:hanging="360"/>
+      </w:pPr>
+      <w:rPr>
+        <w:rFonts w:hint="default" w:ascii="Wingdings" w:hAnsi="Wingdings"/>
+      </w:rPr>
+    </w:lvl>
+    <w:lvl xmlns:w="http://schemas.openxmlformats.org/wordprocessingml/2006/main" w:ilvl="3">
+      <w:start w:val="1"/>
+      <w:numFmt w:val="bullet"/>
+      <w:lvlText w:val=""/>
+      <w:lvlJc w:val="left"/>
+      <w:pPr>
+        <w:ind w:left="2880" w:hanging="360"/>
+      </w:pPr>
+      <w:rPr>
+        <w:rFonts w:hint="default" w:ascii="Symbol" w:hAnsi="Symbol"/>
+      </w:rPr>
+    </w:lvl>
+    <w:lvl xmlns:w="http://schemas.openxmlformats.org/wordprocessingml/2006/main" w:ilvl="4">
+      <w:start w:val="1"/>
+      <w:numFmt w:val="bullet"/>
+      <w:lvlText w:val="o"/>
+      <w:lvlJc w:val="left"/>
+      <w:pPr>
+        <w:ind w:left="3600" w:hanging="360"/>
+      </w:pPr>
+      <w:rPr>
+        <w:rFonts w:hint="default" w:ascii="Courier New" w:hAnsi="Courier New"/>
+      </w:rPr>
+    </w:lvl>
+    <w:lvl xmlns:w="http://schemas.openxmlformats.org/wordprocessingml/2006/main" w:ilvl="5">
+      <w:start w:val="1"/>
+      <w:numFmt w:val="bullet"/>
+      <w:lvlText w:val=""/>
+      <w:lvlJc w:val="left"/>
+      <w:pPr>
+        <w:ind w:left="4320" w:hanging="360"/>
+      </w:pPr>
+      <w:rPr>
+        <w:rFonts w:hint="default" w:ascii="Wingdings" w:hAnsi="Wingdings"/>
+      </w:rPr>
+    </w:lvl>
+    <w:lvl xmlns:w="http://schemas.openxmlformats.org/wordprocessingml/2006/main" w:ilvl="6">
+      <w:start w:val="1"/>
+      <w:numFmt w:val="bullet"/>
+      <w:lvlText w:val=""/>
+      <w:lvlJc w:val="left"/>
+      <w:pPr>
+        <w:ind w:left="5040" w:hanging="360"/>
+      </w:pPr>
+      <w:rPr>
+        <w:rFonts w:hint="default" w:ascii="Symbol" w:hAnsi="Symbol"/>
+      </w:rPr>
+    </w:lvl>
+    <w:lvl xmlns:w="http://schemas.openxmlformats.org/wordprocessingml/2006/main" w:ilvl="7">
+      <w:start w:val="1"/>
+      <w:numFmt w:val="bullet"/>
+      <w:lvlText w:val="o"/>
+      <w:lvlJc w:val="left"/>
+      <w:pPr>
+        <w:ind w:left="5760" w:hanging="360"/>
+      </w:pPr>
+      <w:rPr>
+        <w:rFonts w:hint="default" w:ascii="Courier New" w:hAnsi="Courier New"/>
+      </w:rPr>
+    </w:lvl>
+    <w:lvl xmlns:w="http://schemas.openxmlformats.org/wordprocessingml/2006/main" w:ilvl="8">
+      <w:start w:val="1"/>
+      <w:numFmt w:val="bullet"/>
+      <w:lvlText w:val=""/>
+      <w:lvlJc w:val="left"/>
+      <w:pPr>
+        <w:ind w:left="6480" w:hanging="360"/>
+      </w:pPr>
+      <w:rPr>
+        <w:rFonts w:hint="default" w:ascii="Wingdings" w:hAnsi="Wingdings"/>
+      </w:rPr>
+    </w:lvl>
+  </w:abstractNum>
+  <w:abstractNum xmlns:w="http://schemas.openxmlformats.org/wordprocessingml/2006/main" w:abstractNumId="5">
+    <w:nsid w:val="39c99ac2"/>
+    <w:multiLevelType xmlns:w="http://schemas.openxmlformats.org/wordprocessingml/2006/main" w:val="hybridMultilevel"/>
+    <w:lvl xmlns:w="http://schemas.openxmlformats.org/wordprocessingml/2006/main" w:ilvl="0">
+      <w:start w:val="1"/>
+      <w:numFmt w:val="bullet"/>
+      <w:lvlText w:val=""/>
+      <w:lvlJc w:val="left"/>
+      <w:pPr>
+        <w:ind w:left="720" w:hanging="360"/>
+      </w:pPr>
+      <w:rPr>
+        <w:rFonts w:hint="default" w:ascii="Symbol" w:hAnsi="Symbol"/>
+      </w:rPr>
+    </w:lvl>
+    <w:lvl xmlns:w="http://schemas.openxmlformats.org/wordprocessingml/2006/main" w:ilvl="1">
+      <w:start w:val="1"/>
+      <w:numFmt w:val="bullet"/>
+      <w:lvlText w:val="o"/>
+      <w:lvlJc w:val="left"/>
+      <w:pPr>
+        <w:ind w:left="1440" w:hanging="360"/>
+      </w:pPr>
+      <w:rPr>
+        <w:rFonts w:hint="default" w:ascii="Courier New" w:hAnsi="Courier New"/>
+      </w:rPr>
+    </w:lvl>
+    <w:lvl xmlns:w="http://schemas.openxmlformats.org/wordprocessingml/2006/main" w:ilvl="2">
+      <w:start w:val="1"/>
+      <w:numFmt w:val="bullet"/>
+      <w:lvlText w:val=""/>
+      <w:lvlJc w:val="left"/>
+      <w:pPr>
+        <w:ind w:left="2160" w:hanging="360"/>
+      </w:pPr>
+      <w:rPr>
+        <w:rFonts w:hint="default" w:ascii="Wingdings" w:hAnsi="Wingdings"/>
+      </w:rPr>
+    </w:lvl>
+    <w:lvl xmlns:w="http://schemas.openxmlformats.org/wordprocessingml/2006/main" w:ilvl="3">
+      <w:start w:val="1"/>
+      <w:numFmt w:val="bullet"/>
+      <w:lvlText w:val=""/>
+      <w:lvlJc w:val="left"/>
+      <w:pPr>
+        <w:ind w:left="2880" w:hanging="360"/>
+      </w:pPr>
+      <w:rPr>
+        <w:rFonts w:hint="default" w:ascii="Symbol" w:hAnsi="Symbol"/>
+      </w:rPr>
+    </w:lvl>
+    <w:lvl xmlns:w="http://schemas.openxmlformats.org/wordprocessingml/2006/main" w:ilvl="4">
+      <w:start w:val="1"/>
+      <w:numFmt w:val="bullet"/>
+      <w:lvlText w:val="o"/>
+      <w:lvlJc w:val="left"/>
+      <w:pPr>
+        <w:ind w:left="3600" w:hanging="360"/>
+      </w:pPr>
+      <w:rPr>
+        <w:rFonts w:hint="default" w:ascii="Courier New" w:hAnsi="Courier New"/>
+      </w:rPr>
+    </w:lvl>
+    <w:lvl xmlns:w="http://schemas.openxmlformats.org/wordprocessingml/2006/main" w:ilvl="5">
+      <w:start w:val="1"/>
+      <w:numFmt w:val="bullet"/>
+      <w:lvlText w:val=""/>
+      <w:lvlJc w:val="left"/>
+      <w:pPr>
+        <w:ind w:left="4320" w:hanging="360"/>
+      </w:pPr>
+      <w:rPr>
+        <w:rFonts w:hint="default" w:ascii="Wingdings" w:hAnsi="Wingdings"/>
+      </w:rPr>
+    </w:lvl>
+    <w:lvl xmlns:w="http://schemas.openxmlformats.org/wordprocessingml/2006/main" w:ilvl="6">
+      <w:start w:val="1"/>
+      <w:numFmt w:val="bullet"/>
+      <w:lvlText w:val=""/>
+      <w:lvlJc w:val="left"/>
+      <w:pPr>
+        <w:ind w:left="5040" w:hanging="360"/>
+      </w:pPr>
+      <w:rPr>
+        <w:rFonts w:hint="default" w:ascii="Symbol" w:hAnsi="Symbol"/>
+      </w:rPr>
+    </w:lvl>
+    <w:lvl xmlns:w="http://schemas.openxmlformats.org/wordprocessingml/2006/main" w:ilvl="7">
+      <w:start w:val="1"/>
+      <w:numFmt w:val="bullet"/>
+      <w:lvlText w:val="o"/>
+      <w:lvlJc w:val="left"/>
+      <w:pPr>
+        <w:ind w:left="5760" w:hanging="360"/>
+      </w:pPr>
+      <w:rPr>
+        <w:rFonts w:hint="default" w:ascii="Courier New" w:hAnsi="Courier New"/>
+      </w:rPr>
+    </w:lvl>
+    <w:lvl xmlns:w="http://schemas.openxmlformats.org/wordprocessingml/2006/main" w:ilvl="8">
+      <w:start w:val="1"/>
+      <w:numFmt w:val="bullet"/>
+      <w:lvlText w:val=""/>
+      <w:lvlJc w:val="left"/>
+      <w:pPr>
+        <w:ind w:left="6480" w:hanging="360"/>
+      </w:pPr>
+      <w:rPr>
+        <w:rFonts w:hint="default" w:ascii="Wingdings" w:hAnsi="Wingdings"/>
+      </w:rPr>
+    </w:lvl>
+  </w:abstractNum>
+  <w:abstractNum xmlns:w="http://schemas.openxmlformats.org/wordprocessingml/2006/main" w:abstractNumId="4">
+    <w:nsid w:val="7950859"/>
+    <w:multiLevelType xmlns:w="http://schemas.openxmlformats.org/wordprocessingml/2006/main" w:val="hybridMultilevel"/>
+    <w:lvl xmlns:w="http://schemas.openxmlformats.org/wordprocessingml/2006/main" w:ilvl="0">
+      <w:start w:val="1"/>
+      <w:numFmt w:val="bullet"/>
+      <w:lvlText w:val=""/>
+      <w:lvlJc w:val="left"/>
+      <w:pPr>
+        <w:ind w:left="720" w:hanging="360"/>
+      </w:pPr>
+      <w:rPr>
+        <w:rFonts w:hint="default" w:ascii="Symbol" w:hAnsi="Symbol"/>
+      </w:rPr>
+    </w:lvl>
+    <w:lvl xmlns:w="http://schemas.openxmlformats.org/wordprocessingml/2006/main" w:ilvl="1">
+      <w:start w:val="1"/>
+      <w:numFmt w:val="bullet"/>
+      <w:lvlText w:val="o"/>
+      <w:lvlJc w:val="left"/>
+      <w:pPr>
+        <w:ind w:left="1440" w:hanging="360"/>
+      </w:pPr>
+      <w:rPr>
+        <w:rFonts w:hint="default" w:ascii="Courier New" w:hAnsi="Courier New"/>
+      </w:rPr>
+    </w:lvl>
+    <w:lvl xmlns:w="http://schemas.openxmlformats.org/wordprocessingml/2006/main" w:ilvl="2">
+      <w:start w:val="1"/>
+      <w:numFmt w:val="bullet"/>
+      <w:lvlText w:val=""/>
+      <w:lvlJc w:val="left"/>
+      <w:pPr>
+        <w:ind w:left="2160" w:hanging="360"/>
+      </w:pPr>
+      <w:rPr>
+        <w:rFonts w:hint="default" w:ascii="Wingdings" w:hAnsi="Wingdings"/>
+      </w:rPr>
+    </w:lvl>
+    <w:lvl xmlns:w="http://schemas.openxmlformats.org/wordprocessingml/2006/main" w:ilvl="3">
+      <w:start w:val="1"/>
+      <w:numFmt w:val="bullet"/>
+      <w:lvlText w:val=""/>
+      <w:lvlJc w:val="left"/>
+      <w:pPr>
+        <w:ind w:left="2880" w:hanging="360"/>
+      </w:pPr>
+      <w:rPr>
+        <w:rFonts w:hint="default" w:ascii="Symbol" w:hAnsi="Symbol"/>
+      </w:rPr>
+    </w:lvl>
+    <w:lvl xmlns:w="http://schemas.openxmlformats.org/wordprocessingml/2006/main" w:ilvl="4">
+      <w:start w:val="1"/>
+      <w:numFmt w:val="bullet"/>
+      <w:lvlText w:val="o"/>
+      <w:lvlJc w:val="left"/>
+      <w:pPr>
+        <w:ind w:left="3600" w:hanging="360"/>
+      </w:pPr>
+      <w:rPr>
+        <w:rFonts w:hint="default" w:ascii="Courier New" w:hAnsi="Courier New"/>
+      </w:rPr>
+    </w:lvl>
+    <w:lvl xmlns:w="http://schemas.openxmlformats.org/wordprocessingml/2006/main" w:ilvl="5">
+      <w:start w:val="1"/>
+      <w:numFmt w:val="bullet"/>
+      <w:lvlText w:val=""/>
+      <w:lvlJc w:val="left"/>
+      <w:pPr>
+        <w:ind w:left="4320" w:hanging="360"/>
+      </w:pPr>
+      <w:rPr>
+        <w:rFonts w:hint="default" w:ascii="Wingdings" w:hAnsi="Wingdings"/>
+      </w:rPr>
+    </w:lvl>
+    <w:lvl xmlns:w="http://schemas.openxmlformats.org/wordprocessingml/2006/main" w:ilvl="6">
+      <w:start w:val="1"/>
+      <w:numFmt w:val="bullet"/>
+      <w:lvlText w:val=""/>
+      <w:lvlJc w:val="left"/>
+      <w:pPr>
+        <w:ind w:left="5040" w:hanging="360"/>
+      </w:pPr>
+      <w:rPr>
+        <w:rFonts w:hint="default" w:ascii="Symbol" w:hAnsi="Symbol"/>
+      </w:rPr>
+    </w:lvl>
+    <w:lvl xmlns:w="http://schemas.openxmlformats.org/wordprocessingml/2006/main" w:ilvl="7">
+      <w:start w:val="1"/>
+      <w:numFmt w:val="bullet"/>
+      <w:lvlText w:val="o"/>
+      <w:lvlJc w:val="left"/>
+      <w:pPr>
+        <w:ind w:left="5760" w:hanging="360"/>
+      </w:pPr>
+      <w:rPr>
+        <w:rFonts w:hint="default" w:ascii="Courier New" w:hAnsi="Courier New"/>
+      </w:rPr>
+    </w:lvl>
+    <w:lvl xmlns:w="http://schemas.openxmlformats.org/wordprocessingml/2006/main" w:ilvl="8">
+      <w:start w:val="1"/>
+      <w:numFmt w:val="bullet"/>
+      <w:lvlText w:val=""/>
+      <w:lvlJc w:val="left"/>
+      <w:pPr>
+        <w:ind w:left="6480" w:hanging="360"/>
+      </w:pPr>
+      <w:rPr>
+        <w:rFonts w:hint="default" w:ascii="Wingdings" w:hAnsi="Wingdings"/>
+      </w:rPr>
+    </w:lvl>
+  </w:abstractNum>
   <w:abstractNum xmlns:w="http://schemas.openxmlformats.org/wordprocessingml/2006/main" w:abstractNumId="3">
     <w:nsid w:val="72ed880"/>
     <w:multiLevelType xmlns:w="http://schemas.openxmlformats.org/wordprocessingml/2006/main" w:val="hybridMultilevel"/>
@@ -3887,6 +7946,15 @@
       </w:rPr>
     </w:lvl>
   </w:abstractNum>
+  <w:num w:numId="6">
+    <w:abstractNumId w:val="6"/>
+  </w:num>
+  <w:num w:numId="5">
+    <w:abstractNumId w:val="5"/>
+  </w:num>
+  <w:num w:numId="4">
+    <w:abstractNumId w:val="4"/>
+  </w:num>
   <w:num w:numId="3">
     <w:abstractNumId w:val="3"/>
   </w:num>
@@ -4480,6 +8548,100 @@
       </w:tblCellMar>
     </w:tblPr>
   </w:style>
+  <w:style w:type="paragraph" w:styleId="TOC2">
+    <w:uiPriority w:val="39"/>
+    <w:name w:val="toc 2"/>
+    <w:basedOn w:val="Normal"/>
+    <w:next w:val="Normal"/>
+    <w:unhideWhenUsed/>
+    <w:rsid w:val="7A3317E3"/>
+    <w:pPr>
+      <w:spacing w:after="100"/>
+      <w:ind w:left="220"/>
+    </w:pPr>
+  </w:style>
+  <w:style xmlns:w14="http://schemas.microsoft.com/office/word/2010/wordml" xmlns:mc="http://schemas.openxmlformats.org/markup-compatibility/2006" xmlns:w="http://schemas.openxmlformats.org/wordprocessingml/2006/main" w:type="table" w:styleId="GridTable4-Accent1" mc:Ignorable="w14">
+    <w:name xmlns:w="http://schemas.openxmlformats.org/wordprocessingml/2006/main" w:val="Grid Table 4 Accent 1"/>
+    <w:basedOn xmlns:w="http://schemas.openxmlformats.org/wordprocessingml/2006/main" w:val="TableNormal"/>
+    <w:uiPriority xmlns:w="http://schemas.openxmlformats.org/wordprocessingml/2006/main" w:val="49"/>
+    <w:pPr xmlns:w="http://schemas.openxmlformats.org/wordprocessingml/2006/main">
+      <w:spacing xmlns:w="http://schemas.openxmlformats.org/wordprocessingml/2006/main" w:after="0" w:line="240" w:lineRule="auto"/>
+    </w:pPr>
+    <w:tblPr xmlns:w="http://schemas.openxmlformats.org/wordprocessingml/2006/main">
+      <w:tblStyleRowBandSize w:val="1"/>
+      <w:tblStyleColBandSize w:val="1"/>
+      <w:tblInd w:w="0" w:type="dxa"/>
+      <w:tblBorders>
+        <w:top w:val="single" w:color="9CC2E5" w:themeColor="accent1" w:themeTint="99" w:sz="4" w:space="0"/>
+        <w:left w:val="single" w:color="9CC2E5" w:themeColor="accent1" w:themeTint="99" w:sz="4" w:space="0"/>
+        <w:bottom w:val="single" w:color="9CC2E5" w:themeColor="accent1" w:themeTint="99" w:sz="4" w:space="0"/>
+        <w:right w:val="single" w:color="9CC2E5" w:themeColor="accent1" w:themeTint="99" w:sz="4" w:space="0"/>
+        <w:insideH w:val="single" w:color="9CC2E5" w:themeColor="accent1" w:themeTint="99" w:sz="4" w:space="0"/>
+        <w:insideV w:val="single" w:color="9CC2E5" w:themeColor="accent1" w:themeTint="99" w:sz="4" w:space="0"/>
+      </w:tblBorders>
+      <w:tblCellMar>
+        <w:top w:w="0" w:type="dxa"/>
+        <w:left w:w="108" w:type="dxa"/>
+        <w:bottom w:w="0" w:type="dxa"/>
+        <w:right w:w="108" w:type="dxa"/>
+      </w:tblCellMar>
+    </w:tblPr>
+    <w:tblStylePr xmlns:w="http://schemas.openxmlformats.org/wordprocessingml/2006/main" w:type="firstRow">
+      <w:rPr>
+        <w:b/>
+        <w:bCs/>
+        <w:color w:val="FFFFFF" w:themeColor="background1"/>
+      </w:rPr>
+      <w:tblPr/>
+      <w:tcPr>
+        <w:tcBorders>
+          <w:top w:val="single" w:color="5B9BD5" w:themeColor="accent1" w:sz="4" w:space="0"/>
+          <w:left w:val="single" w:color="5B9BD5" w:themeColor="accent1" w:sz="4" w:space="0"/>
+          <w:bottom w:val="single" w:color="5B9BD5" w:themeColor="accent1" w:sz="4" w:space="0"/>
+          <w:right w:val="single" w:color="5B9BD5" w:themeColor="accent1" w:sz="4" w:space="0"/>
+          <w:insideH w:val="nil"/>
+          <w:insideV w:val="nil"/>
+        </w:tcBorders>
+        <w:shd w:val="clear" w:color="auto" w:fill="5B9BD5" w:themeFill="accent1"/>
+      </w:tcPr>
+    </w:tblStylePr>
+    <w:tblStylePr xmlns:w="http://schemas.openxmlformats.org/wordprocessingml/2006/main" w:type="lastRow">
+      <w:rPr>
+        <w:b/>
+        <w:bCs/>
+      </w:rPr>
+      <w:tblPr/>
+      <w:tcPr>
+        <w:tcBorders>
+          <w:top w:val="double" w:color="5B9BD5" w:themeColor="accent1" w:sz="4" w:space="0"/>
+        </w:tcBorders>
+      </w:tcPr>
+    </w:tblStylePr>
+    <w:tblStylePr xmlns:w="http://schemas.openxmlformats.org/wordprocessingml/2006/main" w:type="firstCol">
+      <w:rPr>
+        <w:b/>
+        <w:bCs/>
+      </w:rPr>
+    </w:tblStylePr>
+    <w:tblStylePr xmlns:w="http://schemas.openxmlformats.org/wordprocessingml/2006/main" w:type="lastCol">
+      <w:rPr>
+        <w:b/>
+        <w:bCs/>
+      </w:rPr>
+    </w:tblStylePr>
+    <w:tblStylePr xmlns:w="http://schemas.openxmlformats.org/wordprocessingml/2006/main" w:type="band1Vert">
+      <w:tblPr/>
+      <w:tcPr>
+        <w:shd w:val="clear" w:color="auto" w:fill="DEEAF6" w:themeFill="accent1" w:themeFillTint="33"/>
+      </w:tcPr>
+    </w:tblStylePr>
+    <w:tblStylePr xmlns:w="http://schemas.openxmlformats.org/wordprocessingml/2006/main" w:type="band1Horz">
+      <w:tblPr/>
+      <w:tcPr>
+        <w:shd w:val="clear" w:color="auto" w:fill="DEEAF6" w:themeFill="accent1" w:themeFillTint="33"/>
+      </w:tcPr>
+    </w:tblStylePr>
+  </w:style>
 </w:styles>
 </file>
 

</xml_diff>